<commit_message>
Integrate savings-target scenarios, weekly composition UI, and compounder logic
</commit_message>
<xml_diff>
--- a/docs/LifeBudget_Micro_Evaluation_and_Reflection.docx
+++ b/docs/LifeBudget_Micro_Evaluation_and_Reflection.docx
@@ -151,26 +151,40 @@
     </w:p>
     <w:p>
       <w:r>
-        <w:t>The deterministic baseline projection provides immediate clarity on the user’s financial trajectory. By keeping the model simple (monthly income minus fixed and variable expenses), the system avoids cognitive overload and allows users to understand their situation without requiring financial expertise. This supports the educational goal of the project and ensures that users can reason about their finances before engaging with more complex simulations.</w:t>
-      </w:r>
-    </w:p>
-    <w:p>
-      <w:r>
-        <w:t>The visualisation of balance over time proved particularly effective in making abstract numbers tangible. The line chart representation helps users quickly identify trends and potential issues, such as negative trajectories or low surplus margins.</w:t>
-      </w:r>
-    </w:p>
-    <w:p>
-      <w:pPr>
-        <w:rPr>
-          <w:b/>
-          <w:bCs/>
-        </w:rPr>
-      </w:pPr>
-      <w:r>
-        <w:rPr>
-          <w:b/>
-          <w:bCs/>
-        </w:rPr>
+        <w:t>The deterministic baseline projection provides immediate clarity on the user’s financial situation. By keeping the model simple (weekly income minus fixed and variable expenses), the system avoids cognitive overload and allows users to understand their finances without requiring prior expertise. This supports the educational goal of the project and enables informed reasoning before engaging with more complex simulations.</w:t>
+      </w:r>
+    </w:p>
+    <w:p>
+      <w:r>
+        <w:t>Early iterations focused on projecting balance over time, where line chart visualisations helped make abstract values tangible and allowed users to identify trends such as persistent deficits or narrow surplus margins.</w:t>
+      </w:r>
+    </w:p>
+    <w:p>
+      <w:r>
+        <w:t>In later iterations, the baseline step was refined into a purely diagnostic view. Rather than immediately projecting future balances, Step 1 now presents a static representation of the current weekly allocation, encouraging users to first understand their financial structure before exploring temporal or behavioural change.</w:t>
+      </w:r>
+    </w:p>
+    <w:p>
+      <w:r>
+        <w:t>To support this shift, a horizontal stacked bar visualisation was introduced to represent weekly spending proportions across categories. This design prioritises proportional reasoning over absolute forecasting and helps users quickly identify structural imbalances. Instead of duplicating the same information at monthly and yearly levels, a concise scale note communicates equivalent values at different time scales, reducing visual clutter while preserving interpretability.</w:t>
+      </w:r>
+      <w:r>
+        <w:br w:type="page"/>
+      </w:r>
+    </w:p>
+    <w:p>
+      <w:pPr>
+        <w:rPr>
+          <w:b/>
+          <w:bCs/>
+        </w:rPr>
+      </w:pPr>
+      <w:r>
+        <w:rPr>
+          <w:b/>
+          <w:bCs/>
+        </w:rPr>
+        <w:lastRenderedPageBreak/>
         <w:t>2.2 Scenario Simulation (Compounder+)</w:t>
       </w:r>
     </w:p>
@@ -196,7 +210,7 @@
     </w:p>
     <w:p>
       <w:r>
-        <w:t>The ability to adjust iteration count, variability percentage, and random seed also adds transparency and control, reinforcing the educational nature of the tool.</w:t>
+        <w:t>The system allows users to control simulation behaviour primarily through high-level conceptual controls, such as expense predictability and result detail, which are designed to be intuitive and non-technical. For transparency and reproducibility, these controls are internally mapped to technical parameters, including iteration count, spending variability, and random seed, preserving interpretability for non-technical users while maintaining explicit control and traceability at the system level.</w:t>
       </w:r>
     </w:p>
     <w:p>
@@ -213,24 +227,6 @@
           <w:bCs/>
           <w:lang w:val="es-ES"/>
         </w:rPr>
-        <w:br w:type="page"/>
-      </w:r>
-    </w:p>
-    <w:p>
-      <w:pPr>
-        <w:rPr>
-          <w:b/>
-          <w:bCs/>
-          <w:lang w:val="es-ES"/>
-        </w:rPr>
-      </w:pPr>
-      <w:r>
-        <w:rPr>
-          <w:b/>
-          <w:bCs/>
-          <w:lang w:val="es-ES"/>
-        </w:rPr>
-        <w:lastRenderedPageBreak/>
         <w:t xml:space="preserve">2.3 </w:t>
       </w:r>
       <w:proofErr w:type="spellStart"/>
@@ -412,6 +408,12 @@
     </w:p>
     <w:p>
       <w:r>
+        <w:br w:type="page"/>
+      </w:r>
+    </w:p>
+    <w:p>
+      <w:r>
+        <w:lastRenderedPageBreak/>
         <w:t>This excludes real-world complexity such as:</w:t>
       </w:r>
     </w:p>
@@ -469,42 +471,31 @@
     </w:p>
     <w:p>
       <w:r>
-        <w:t>Additionally, the current stochastic model assumes Gaussian variability in monthly spending, which may under-represent rare but high-impact expenses (i.e., heavy-tailed behaviour); a more realistic version would consider alternative distributions or event-based shocks.</w:t>
-      </w:r>
-    </w:p>
-    <w:p>
-      <w:r>
-        <w:t>This simplification was intentional to avoid false precision and to maintain conceptual clarity. Introducing too many variables at this stage would reduce interpretability and conflict with the project’s educational goals.</w:t>
-      </w:r>
-    </w:p>
-    <w:p>
-      <w:pPr>
-        <w:rPr>
-          <w:b/>
-          <w:bCs/>
-        </w:rPr>
-      </w:pPr>
-      <w:r>
-        <w:rPr>
-          <w:b/>
-          <w:bCs/>
-        </w:rPr>
-        <w:br w:type="page"/>
-      </w:r>
-    </w:p>
-    <w:p>
-      <w:pPr>
-        <w:rPr>
-          <w:b/>
-          <w:bCs/>
-        </w:rPr>
-      </w:pPr>
-      <w:r>
-        <w:rPr>
-          <w:b/>
-          <w:bCs/>
-        </w:rPr>
-        <w:lastRenderedPageBreak/>
+        <w:t>Additionally, the stochastic component assumes Gaussian variability in weekly spending, which may under-represent rare but high-impact events (i.e. heavy-tailed behaviour). A more realistic formulation could explore alternative distributions or explicit event-based shocks.</w:t>
+      </w:r>
+    </w:p>
+    <w:p>
+      <w:r>
+        <w:t>These simplifications were intentional. The objective was to avoid false precision and preserve conceptual clarity. Introducing additional financial mechanisms at this stage would increase complexity without necessarily improving interpretability, which would conflict with the project’s educational focus.</w:t>
+      </w:r>
+    </w:p>
+    <w:p>
+      <w:r>
+        <w:t>At the baseline level, the model does not explicitly represent one-off or shock expenses (e.g. unexpected repairs or unplanned social spending). These events were deliberately excluded from the baseline representation to keep the diagnostic view focused on structural allocation rather than exceptional cases.</w:t>
+      </w:r>
+    </w:p>
+    <w:p>
+      <w:pPr>
+        <w:rPr>
+          <w:b/>
+          <w:bCs/>
+        </w:rPr>
+      </w:pPr>
+      <w:r>
+        <w:rPr>
+          <w:b/>
+          <w:bCs/>
+        </w:rPr>
         <w:t>3.2 No Persistence Layer</w:t>
       </w:r>
     </w:p>
@@ -579,7 +570,17 @@
       </w:r>
       <w:proofErr w:type="spellEnd"/>
       <w:r>
-        <w:t xml:space="preserve"> Micro is limited to short-term projections (3–12 months). Long-term forecasting was deliberately excluded to avoid overpromising accuracy and to stay aligned with the original problem framing: </w:t>
+        <w:t xml:space="preserve"> Micro is limited to short-term </w:t>
+      </w:r>
+      <w:r>
+        <w:rPr>
+          <w:b/>
+          <w:bCs/>
+        </w:rPr>
+        <w:t>weekly projections</w:t>
+      </w:r>
+      <w:r>
+        <w:t xml:space="preserve">. Long-term forecasting was deliberately excluded to avoid overpromising accuracy and to stay aligned with the original problem framing: </w:t>
       </w:r>
       <w:r>
         <w:rPr>
@@ -591,6 +592,22 @@
       <w:r>
         <w:t>, not retirement planning.</w:t>
       </w:r>
+      <w:r>
+        <w:t xml:space="preserve"> </w:t>
+      </w:r>
+    </w:p>
+    <w:p>
+      <w:r>
+        <w:t xml:space="preserve">During implementation, the temporal granularity was refined from monthly to weekly projections. This change improved short-term interpretability and aligned the system more closely with how </w:t>
+      </w:r>
+      <w:proofErr w:type="gramStart"/>
+      <w:r>
+        <w:t>users</w:t>
+      </w:r>
+      <w:proofErr w:type="gramEnd"/>
+      <w:r>
+        <w:t xml:space="preserve"> reason about everyday financial decisions, while preserving the original MVP scope and educational intent.</w:t>
+      </w:r>
     </w:p>
     <w:p>
       <w:pPr>
@@ -630,6 +647,22 @@
           <w:b/>
           <w:bCs/>
         </w:rPr>
+        <w:br w:type="page"/>
+      </w:r>
+    </w:p>
+    <w:p>
+      <w:pPr>
+        <w:rPr>
+          <w:b/>
+          <w:bCs/>
+        </w:rPr>
+      </w:pPr>
+      <w:r>
+        <w:rPr>
+          <w:b/>
+          <w:bCs/>
+        </w:rPr>
+        <w:lastRenderedPageBreak/>
         <w:t>4. Design and Implementation Decisions</w:t>
       </w:r>
     </w:p>
@@ -753,22 +786,6 @@
           <w:b/>
           <w:bCs/>
         </w:rPr>
-        <w:br w:type="page"/>
-      </w:r>
-    </w:p>
-    <w:p>
-      <w:pPr>
-        <w:rPr>
-          <w:b/>
-          <w:bCs/>
-        </w:rPr>
-      </w:pPr>
-      <w:r>
-        <w:rPr>
-          <w:b/>
-          <w:bCs/>
-        </w:rPr>
-        <w:lastRenderedPageBreak/>
         <w:t>4.3 Session State Management</w:t>
       </w:r>
     </w:p>
@@ -818,6 +835,83 @@
     <w:p>
       <w:r>
         <w:t>This reflects a conscious decision to prioritise user comprehension over technical novelty.</w:t>
+      </w:r>
+    </w:p>
+    <w:p>
+      <w:pPr>
+        <w:rPr>
+          <w:b/>
+          <w:bCs/>
+        </w:rPr>
+      </w:pPr>
+      <w:r>
+        <w:rPr>
+          <w:b/>
+          <w:bCs/>
+        </w:rPr>
+        <w:t>4.5 From Design to Implementation (Core Functionality First)</w:t>
+      </w:r>
+    </w:p>
+    <w:p>
+      <w:r>
+        <w:t xml:space="preserve">During development, </w:t>
+      </w:r>
+      <w:proofErr w:type="spellStart"/>
+      <w:r>
+        <w:t>LifeBudget</w:t>
+      </w:r>
+      <w:proofErr w:type="spellEnd"/>
+      <w:r>
+        <w:t xml:space="preserve"> Micro transitioned from a conceptual design into a working system by prioritising its core functionality: the budgeting projection and scenario simulation logic. Instead of focusing on UI polish, early implementation centred on producing a runnable artefact that transforms user inputs into interpretable baseline and scenario outcomes. This shift surfaced technical risks earlier than expected—particularly </w:t>
+      </w:r>
+      <w:proofErr w:type="spellStart"/>
+      <w:r>
+        <w:t>Streamlit</w:t>
+      </w:r>
+      <w:proofErr w:type="spellEnd"/>
+      <w:r>
+        <w:t xml:space="preserve"> rerun behaviour and session-state complexity—which required iterative refactoring to stabilise outputs and preserve scenario semantics. Progress was therefore tracked through demonstrable behaviour and evidence (working versions, commits, and implementation logs) rather than planned features.</w:t>
+      </w:r>
+    </w:p>
+    <w:p>
+      <w:pPr>
+        <w:rPr>
+          <w:b/>
+          <w:bCs/>
+        </w:rPr>
+      </w:pPr>
+      <w:r>
+        <w:rPr>
+          <w:b/>
+          <w:bCs/>
+        </w:rPr>
+        <w:br w:type="page"/>
+      </w:r>
+    </w:p>
+    <w:p>
+      <w:pPr>
+        <w:rPr>
+          <w:b/>
+          <w:bCs/>
+        </w:rPr>
+      </w:pPr>
+      <w:r>
+        <w:rPr>
+          <w:b/>
+          <w:bCs/>
+        </w:rPr>
+        <w:lastRenderedPageBreak/>
+        <w:t>4.6 Narrative Framing and Progressive Guidance</w:t>
+      </w:r>
+    </w:p>
+    <w:p>
+      <w:r>
+        <w:t>Small but deliberate narrative elements were added to guide user reasoning without introducing additional interface complexity. Step 1 includes a brief framing statement clarifying that no behavioural change is applied at this stage, helping align expectations and prevent misinterpretation.</w:t>
+      </w:r>
+    </w:p>
+    <w:p>
+      <w:r>
+        <w:t>Similarly, transitions between steps are communicated through neutral calls-to-action (e.g. “Next: explore what happens if you change something”), avoiding urgency, gamification, or prescriptive language. This reinforces the system’s role as a decision-support tool rather than a persuasive or optimisation-driven application.</w:t>
       </w:r>
     </w:p>
     <w:p/>
@@ -905,6 +999,581 @@
         <w:t>Working through real issues such as unstable outputs, state resets, and UI flow problems provided practical insight that could not be gained from theoretical exercises alone.</w:t>
       </w:r>
     </w:p>
+    <w:p>
+      <w:pPr>
+        <w:rPr>
+          <w:b/>
+          <w:bCs/>
+        </w:rPr>
+      </w:pPr>
+      <w:r>
+        <w:rPr>
+          <w:b/>
+          <w:bCs/>
+        </w:rPr>
+        <w:t>5.</w:t>
+      </w:r>
+      <w:r>
+        <w:rPr>
+          <w:b/>
+          <w:bCs/>
+        </w:rPr>
+        <w:t>1</w:t>
+      </w:r>
+      <w:r>
+        <w:rPr>
+          <w:b/>
+          <w:bCs/>
+        </w:rPr>
+        <w:t xml:space="preserve"> Informal User Testing and Iterative Validation</w:t>
+      </w:r>
+    </w:p>
+    <w:p>
+      <w:r>
+        <w:t xml:space="preserve">As this project is an individual academic MVP developed under time and scope constraints, no formal user study or structured usability testing sessions were conducted. Instead, the system was evaluated through </w:t>
+      </w:r>
+      <w:r>
+        <w:rPr>
+          <w:b/>
+          <w:bCs/>
+        </w:rPr>
+        <w:t>iterative, scenario-based testing and developer-led validation</w:t>
+      </w:r>
+      <w:r>
+        <w:t>, following a formative evaluation approach. This method aligns with the exploratory nature of the project and supports continuous refinement through hands-on interaction with the system.</w:t>
+      </w:r>
+    </w:p>
+    <w:p>
+      <w:r>
+        <w:t xml:space="preserve">The primary objective of this evaluation strategy was not statistical validation, but </w:t>
+      </w:r>
+      <w:r>
+        <w:rPr>
+          <w:b/>
+          <w:bCs/>
+        </w:rPr>
+        <w:t>behavioural correctness, interpretability, and conceptual clarity</w:t>
+      </w:r>
+      <w:r>
+        <w:t>. Each iteration of the system was tested against realistic usage scenarios to assess whether the outputs were understandable, logically consistent, and aligned with the intended user mental model.</w:t>
+      </w:r>
+    </w:p>
+    <w:p>
+      <w:pPr>
+        <w:rPr>
+          <w:b/>
+          <w:bCs/>
+        </w:rPr>
+      </w:pPr>
+      <w:r>
+        <w:rPr>
+          <w:b/>
+          <w:bCs/>
+        </w:rPr>
+        <w:t>What Was Tested</w:t>
+      </w:r>
+    </w:p>
+    <w:p>
+      <w:r>
+        <w:t>The evaluation focused on the following core aspects of the system:</w:t>
+      </w:r>
+    </w:p>
+    <w:p>
+      <w:pPr>
+        <w:pStyle w:val="ListParagraph"/>
+        <w:numPr>
+          <w:ilvl w:val="0"/>
+          <w:numId w:val="36"/>
+        </w:numPr>
+        <w:ind w:left="709"/>
+      </w:pPr>
+      <w:r>
+        <w:rPr>
+          <w:b/>
+          <w:bCs/>
+        </w:rPr>
+        <w:t>Baseline clarity</w:t>
+      </w:r>
+      <w:r>
+        <w:br/>
+        <w:t>Whether the baseline financial state was clearly represented and understandable before any scenarios were applied.</w:t>
+      </w:r>
+    </w:p>
+    <w:p>
+      <w:pPr>
+        <w:pStyle w:val="ListParagraph"/>
+        <w:numPr>
+          <w:ilvl w:val="0"/>
+          <w:numId w:val="36"/>
+        </w:numPr>
+        <w:ind w:left="709"/>
+      </w:pPr>
+      <w:r>
+        <w:rPr>
+          <w:b/>
+          <w:bCs/>
+        </w:rPr>
+        <w:t>Scenario parameter interpretation</w:t>
+      </w:r>
+      <w:r>
+        <w:br/>
+        <w:t>Whether changes to variable parameters (e.g. variable expenses, discretionary spending adjustments) produced predictable and intuitive outcomes.</w:t>
+      </w:r>
+    </w:p>
+    <w:p>
+      <w:pPr>
+        <w:pStyle w:val="ListParagraph"/>
+        <w:numPr>
+          <w:ilvl w:val="0"/>
+          <w:numId w:val="36"/>
+        </w:numPr>
+        <w:ind w:left="709"/>
+      </w:pPr>
+      <w:r>
+        <w:rPr>
+          <w:b/>
+          <w:bCs/>
+        </w:rPr>
+        <w:lastRenderedPageBreak/>
+        <w:t>A/B comparison semantics</w:t>
+      </w:r>
+      <w:r>
+        <w:br/>
+        <w:t>Whether the distinction between baseline (A) and scenario (B) was conceptually clear and whether delta calculations were meaningful and correctly interpreted.</w:t>
+      </w:r>
+    </w:p>
+    <w:p>
+      <w:pPr>
+        <w:pStyle w:val="ListParagraph"/>
+        <w:numPr>
+          <w:ilvl w:val="0"/>
+          <w:numId w:val="36"/>
+        </w:numPr>
+        <w:ind w:left="709"/>
+      </w:pPr>
+      <w:r>
+        <w:rPr>
+          <w:b/>
+          <w:bCs/>
+        </w:rPr>
+        <w:t>Explanation layer clarity</w:t>
+      </w:r>
+      <w:r>
+        <w:br/>
+        <w:t xml:space="preserve">Whether the rule-based explanation layer successfully communicated </w:t>
+      </w:r>
+      <w:r>
+        <w:rPr>
+          <w:i/>
+          <w:iCs/>
+        </w:rPr>
+        <w:t>why</w:t>
+      </w:r>
+      <w:r>
+        <w:t xml:space="preserve"> changes occurred, rather than simply presenting numerical results.</w:t>
+      </w:r>
+    </w:p>
+    <w:p>
+      <w:pPr>
+        <w:pStyle w:val="ListParagraph"/>
+        <w:numPr>
+          <w:ilvl w:val="0"/>
+          <w:numId w:val="36"/>
+        </w:numPr>
+        <w:ind w:left="709"/>
+      </w:pPr>
+      <w:r>
+        <w:rPr>
+          <w:b/>
+          <w:bCs/>
+        </w:rPr>
+        <w:t>Stability and reproducibility</w:t>
+      </w:r>
+      <w:r>
+        <w:br/>
+        <w:t>Whether repeated runs under fixed random seeds produced consistent and interpretable results, particularly in Monte Carlo-based variability modelling.</w:t>
+      </w:r>
+    </w:p>
+    <w:p>
+      <w:pPr>
+        <w:rPr>
+          <w:b/>
+          <w:bCs/>
+        </w:rPr>
+      </w:pPr>
+      <w:r>
+        <w:rPr>
+          <w:b/>
+          <w:bCs/>
+        </w:rPr>
+        <w:t>How It Was Tested</w:t>
+      </w:r>
+    </w:p>
+    <w:p>
+      <w:r>
+        <w:t>The system was evaluated using a combination of:</w:t>
+      </w:r>
+    </w:p>
+    <w:p>
+      <w:pPr>
+        <w:pStyle w:val="ListParagraph"/>
+        <w:numPr>
+          <w:ilvl w:val="0"/>
+          <w:numId w:val="35"/>
+        </w:numPr>
+        <w:ind w:left="709"/>
+      </w:pPr>
+      <w:r>
+        <w:rPr>
+          <w:b/>
+          <w:bCs/>
+        </w:rPr>
+        <w:t>Manual scenario walkthroughs</w:t>
+      </w:r>
+      <w:r>
+        <w:br/>
+        <w:t>Step-by-step execution of realistic financial scenarios to observe behavioural responses and output coherence.</w:t>
+      </w:r>
+    </w:p>
+    <w:p>
+      <w:pPr>
+        <w:pStyle w:val="ListParagraph"/>
+        <w:numPr>
+          <w:ilvl w:val="0"/>
+          <w:numId w:val="35"/>
+        </w:numPr>
+        <w:ind w:left="709"/>
+      </w:pPr>
+      <w:r>
+        <w:rPr>
+          <w:b/>
+          <w:bCs/>
+        </w:rPr>
+        <w:t>Edge case testing</w:t>
+      </w:r>
+      <w:r>
+        <w:br/>
+      </w:r>
+      <w:proofErr w:type="spellStart"/>
+      <w:r>
+        <w:t>Testing</w:t>
+      </w:r>
+      <w:proofErr w:type="spellEnd"/>
+      <w:r>
+        <w:t xml:space="preserve"> boundary conditions such as zero discretionary spend, unusually high variable expenses, and extreme scenario deltas.</w:t>
+      </w:r>
+    </w:p>
+    <w:p>
+      <w:pPr>
+        <w:pStyle w:val="ListParagraph"/>
+        <w:numPr>
+          <w:ilvl w:val="0"/>
+          <w:numId w:val="35"/>
+        </w:numPr>
+        <w:ind w:left="709"/>
+      </w:pPr>
+      <w:r>
+        <w:rPr>
+          <w:b/>
+          <w:bCs/>
+        </w:rPr>
+        <w:t>Repeated runs with fixed seeds</w:t>
+      </w:r>
+      <w:r>
+        <w:br/>
+        <w:t>To validate stability and ensure that stochastic behaviour remained controlled and explainable.</w:t>
+      </w:r>
+    </w:p>
+    <w:p>
+      <w:pPr>
+        <w:pStyle w:val="ListParagraph"/>
+        <w:numPr>
+          <w:ilvl w:val="0"/>
+          <w:numId w:val="35"/>
+        </w:numPr>
+        <w:ind w:left="709"/>
+      </w:pPr>
+      <w:r>
+        <w:rPr>
+          <w:b/>
+          <w:bCs/>
+        </w:rPr>
+        <w:t>Cognitive walkthroughs</w:t>
+      </w:r>
+      <w:r>
+        <w:br/>
+        <w:t>Acting as a proxy user to assess whether the outputs would be understandable to a non-technical user, focusing on clarity, flow, and interpretability rather than technical correctness alone.</w:t>
+      </w:r>
+    </w:p>
+    <w:p>
+      <w:r>
+        <w:t>This approach allowed continuous feedback loops between observation, interpretation, and implementation changes.</w:t>
+      </w:r>
+    </w:p>
+    <w:p>
+      <w:pPr>
+        <w:rPr>
+          <w:b/>
+          <w:bCs/>
+        </w:rPr>
+      </w:pPr>
+      <w:r>
+        <w:rPr>
+          <w:b/>
+          <w:bCs/>
+        </w:rPr>
+        <w:t>Findings</w:t>
+      </w:r>
+    </w:p>
+    <w:p>
+      <w:r>
+        <w:t>Several usability and conceptual issues were identified through this process:</w:t>
+      </w:r>
+    </w:p>
+    <w:p>
+      <w:pPr>
+        <w:pStyle w:val="ListParagraph"/>
+        <w:numPr>
+          <w:ilvl w:val="0"/>
+          <w:numId w:val="34"/>
+        </w:numPr>
+        <w:ind w:left="709"/>
+      </w:pPr>
+      <w:r>
+        <w:rPr>
+          <w:b/>
+          <w:bCs/>
+        </w:rPr>
+        <w:t>Confusion between A/B scenario semantics</w:t>
+      </w:r>
+      <w:r>
+        <w:br/>
+        <w:t>Early versions did not sufficiently distinguish between baseline and scenario deltas, leading to ambiguous interpretation.</w:t>
+      </w:r>
+    </w:p>
+    <w:p>
+      <w:pPr>
+        <w:pStyle w:val="ListParagraph"/>
+        <w:numPr>
+          <w:ilvl w:val="0"/>
+          <w:numId w:val="34"/>
+        </w:numPr>
+        <w:ind w:left="709"/>
+      </w:pPr>
+      <w:r>
+        <w:rPr>
+          <w:b/>
+          <w:bCs/>
+        </w:rPr>
+        <w:t>Overly vague explanation outputs</w:t>
+      </w:r>
+      <w:r>
+        <w:br/>
+        <w:t>Initial explanation layers were too generic and did not clearly map input changes to output behaviour.</w:t>
+      </w:r>
+    </w:p>
+    <w:p>
+      <w:pPr>
+        <w:pStyle w:val="ListParagraph"/>
+        <w:numPr>
+          <w:ilvl w:val="0"/>
+          <w:numId w:val="34"/>
+        </w:numPr>
+        <w:ind w:left="709"/>
+      </w:pPr>
+      <w:r>
+        <w:rPr>
+          <w:b/>
+          <w:bCs/>
+        </w:rPr>
+        <w:t>Misinterpretation of variability</w:t>
+      </w:r>
+      <w:r>
+        <w:br/>
+        <w:t>Monte Carlo variability was initially perceived as randomness rather than controlled simulation.</w:t>
+      </w:r>
+    </w:p>
+    <w:p>
+      <w:pPr>
+        <w:pStyle w:val="ListParagraph"/>
+        <w:numPr>
+          <w:ilvl w:val="0"/>
+          <w:numId w:val="34"/>
+        </w:numPr>
+        <w:ind w:left="709"/>
+      </w:pPr>
+      <w:r>
+        <w:rPr>
+          <w:b/>
+          <w:bCs/>
+        </w:rPr>
+        <w:t>State handling inconsistencies</w:t>
+      </w:r>
+      <w:r>
+        <w:br/>
+        <w:t>Certain parameter changes caused unintended resets or stale state propagation across runs.</w:t>
+      </w:r>
+    </w:p>
+    <w:p>
+      <w:pPr>
+        <w:rPr>
+          <w:b/>
+          <w:bCs/>
+        </w:rPr>
+      </w:pPr>
+      <w:r>
+        <w:rPr>
+          <w:b/>
+          <w:bCs/>
+        </w:rPr>
+        <w:br w:type="page"/>
+      </w:r>
+    </w:p>
+    <w:p>
+      <w:pPr>
+        <w:rPr>
+          <w:b/>
+          <w:bCs/>
+        </w:rPr>
+      </w:pPr>
+      <w:r>
+        <w:rPr>
+          <w:b/>
+          <w:bCs/>
+        </w:rPr>
+        <w:lastRenderedPageBreak/>
+        <w:t>Design Changes Resulting from Evaluation</w:t>
+      </w:r>
+    </w:p>
+    <w:p>
+      <w:r>
+        <w:t>The following design refinements were implemented directly in response to these findings:</w:t>
+      </w:r>
+    </w:p>
+    <w:p>
+      <w:pPr>
+        <w:pStyle w:val="ListParagraph"/>
+        <w:numPr>
+          <w:ilvl w:val="0"/>
+          <w:numId w:val="33"/>
+        </w:numPr>
+        <w:ind w:left="709"/>
+      </w:pPr>
+      <w:r>
+        <w:rPr>
+          <w:b/>
+          <w:bCs/>
+        </w:rPr>
+        <w:t>Explicit separation of A/B deltas</w:t>
+      </w:r>
+      <w:r>
+        <w:br/>
+        <w:t>The comparison logic was restructured to clearly isolate baseline (A) and scenario (B) changes, improving semantic clarity.</w:t>
+      </w:r>
+    </w:p>
+    <w:p>
+      <w:pPr>
+        <w:pStyle w:val="ListParagraph"/>
+        <w:numPr>
+          <w:ilvl w:val="0"/>
+          <w:numId w:val="33"/>
+        </w:numPr>
+        <w:ind w:left="709"/>
+      </w:pPr>
+      <w:r>
+        <w:rPr>
+          <w:b/>
+          <w:bCs/>
+        </w:rPr>
+        <w:t>Refinement of the explanation layer</w:t>
+      </w:r>
+      <w:r>
+        <w:br/>
+        <w:t>The rule-based explanation system was expanded to provide more specific, context-aware feedback on why changes occurred.</w:t>
+      </w:r>
+    </w:p>
+    <w:p>
+      <w:pPr>
+        <w:pStyle w:val="ListParagraph"/>
+        <w:numPr>
+          <w:ilvl w:val="0"/>
+          <w:numId w:val="33"/>
+        </w:numPr>
+        <w:ind w:left="709"/>
+      </w:pPr>
+      <w:r>
+        <w:rPr>
+          <w:b/>
+          <w:bCs/>
+        </w:rPr>
+        <w:t>Controlled stochastic behaviour</w:t>
+      </w:r>
+      <w:r>
+        <w:br/>
+        <w:t>Fixed random seeds and clearer variance signalling were introduced to ensure that variability was interpretable and reproducible.</w:t>
+      </w:r>
+    </w:p>
+    <w:p>
+      <w:pPr>
+        <w:pStyle w:val="ListParagraph"/>
+        <w:numPr>
+          <w:ilvl w:val="0"/>
+          <w:numId w:val="33"/>
+        </w:numPr>
+        <w:ind w:left="709"/>
+      </w:pPr>
+      <w:r>
+        <w:rPr>
+          <w:b/>
+          <w:bCs/>
+        </w:rPr>
+        <w:t>Session state restructuring</w:t>
+      </w:r>
+      <w:r>
+        <w:br/>
+        <w:t>State management was redesigned to prevent unintended resets and ensure consistent behaviour across iterative runs.</w:t>
+      </w:r>
+    </w:p>
+    <w:p>
+      <w:r>
+        <w:t>These changes significantly improved both the technical robustness and the conceptual transparency of the system.</w:t>
+      </w:r>
+    </w:p>
+    <w:p>
+      <w:pPr>
+        <w:rPr>
+          <w:b/>
+          <w:bCs/>
+        </w:rPr>
+      </w:pPr>
+      <w:r>
+        <w:rPr>
+          <w:b/>
+          <w:bCs/>
+        </w:rPr>
+        <w:t>Summary</w:t>
+      </w:r>
+    </w:p>
+    <w:p>
+      <w:r>
+        <w:t xml:space="preserve">Although no formal user testing sessions were conducted, the system underwent continuous formative evaluation through iterative, scenario-driven testing. This process played a critical role in shaping the final design and ensured that the system remained </w:t>
+      </w:r>
+      <w:r>
+        <w:rPr>
+          <w:b/>
+          <w:bCs/>
+        </w:rPr>
+        <w:t>interpretable, stable, and aligned with the intended user experience</w:t>
+      </w:r>
+      <w:r>
+        <w:t>.</w:t>
+      </w:r>
+    </w:p>
+    <w:p>
+      <w:r>
+        <w:t>This evaluation approach is consistent with the exploratory nature of the project and supports the overall goal of delivering a transparent, educational, and behaviourally coherent MVP.</w:t>
+      </w:r>
+    </w:p>
     <w:p/>
     <w:p>
       <w:pPr>
@@ -943,7 +1612,17 @@
     </w:p>
     <w:p/>
     <w:p>
-      <w:r>
+      <w:pPr>
+        <w:rPr>
+          <w:b/>
+          <w:bCs/>
+        </w:rPr>
+      </w:pPr>
+      <w:r>
+        <w:rPr>
+          <w:b/>
+          <w:bCs/>
+        </w:rPr>
         <w:br w:type="page"/>
       </w:r>
     </w:p>
@@ -965,125 +1644,157 @@
     </w:p>
     <w:p>
       <w:r>
-        <w:t xml:space="preserve">There are several clear directions for future development, identified directly from the limitations and design trade-offs observed during </w:t>
-      </w:r>
-      <w:proofErr w:type="spellStart"/>
-      <w:proofErr w:type="gramStart"/>
-      <w:r>
-        <w:t>implementation.</w:t>
-      </w:r>
-      <w:r>
-        <w:t>Introduce</w:t>
-      </w:r>
-      <w:proofErr w:type="spellEnd"/>
-      <w:proofErr w:type="gramEnd"/>
-      <w:r>
-        <w:t xml:space="preserve"> persistent storage to allow users to save and revisit scenarios.</w:t>
+        <w:t>Several clear directions for future development emerged directly from the limitations and design trade-offs identified during implementation. These improvements were intentionally deferred to preserve scope discipline and conceptual clarity during the MVP phase. The primary priority was to validate the reasoning model before extending functionality.</w:t>
+      </w:r>
+      <w:r>
+        <w:t xml:space="preserve"> </w:t>
+      </w:r>
+      <w:r>
+        <w:t>Potential future enhancements include:</w:t>
       </w:r>
     </w:p>
     <w:p>
       <w:pPr>
         <w:pStyle w:val="ListParagraph"/>
         <w:numPr>
-          <w:ilvl w:val="1"/>
-          <w:numId w:val="1"/>
+          <w:ilvl w:val="0"/>
+          <w:numId w:val="37"/>
         </w:numPr>
-        <w:ind w:left="709"/>
-      </w:pPr>
-      <w:r>
-        <w:rPr>
-          <w:b/>
-          <w:bCs/>
-        </w:rPr>
-        <w:t>Introduce persistent storage</w:t>
-      </w:r>
-      <w:r>
-        <w:t xml:space="preserve"> to allow users to save and revisit scenarios across sessions. This would address the current loss of state when the application is restarted and enable longer-term reflective use.</w:t>
+      </w:pPr>
+      <w:r>
+        <w:rPr>
+          <w:b/>
+          <w:bCs/>
+        </w:rPr>
+        <w:t>Persistent storage:</w:t>
+      </w:r>
+      <w:r>
+        <w:t xml:space="preserve"> </w:t>
+      </w:r>
+      <w:r>
+        <w:t>Introduce persistent storage to allow users to save and revisit scenarios across sessions. This would address the current loss of state when the application is restarted and enable longer-term reflective use.</w:t>
       </w:r>
     </w:p>
     <w:p>
       <w:pPr>
         <w:pStyle w:val="ListParagraph"/>
         <w:numPr>
-          <w:ilvl w:val="1"/>
-          <w:numId w:val="1"/>
+          <w:ilvl w:val="0"/>
+          <w:numId w:val="37"/>
         </w:numPr>
-        <w:ind w:left="709"/>
-      </w:pPr>
-      <w:r>
-        <w:rPr>
-          <w:b/>
-          <w:bCs/>
-        </w:rPr>
-        <w:t>Support irregular income and expense patterns</w:t>
-      </w:r>
-      <w:r>
-        <w:t>, such as seasonal work or one-off costs, to reduce the rigidity of the current monthly model and better reflect real-world financial behaviour.</w:t>
+      </w:pPr>
+      <w:r>
+        <w:rPr>
+          <w:b/>
+          <w:bCs/>
+        </w:rPr>
+        <w:t>Support for irregular income and expenses:</w:t>
+      </w:r>
+      <w:r>
+        <w:t xml:space="preserve"> </w:t>
+      </w:r>
+      <w:r>
+        <w:t>Extend the financial model to accommodate irregular income streams, seasonal work, and non-recurring expenses, reducing the rigidity of the current weekly abstraction and better reflecting real-world financial behaviour.</w:t>
       </w:r>
     </w:p>
     <w:p>
       <w:pPr>
         <w:pStyle w:val="ListParagraph"/>
         <w:numPr>
-          <w:ilvl w:val="1"/>
-          <w:numId w:val="1"/>
+          <w:ilvl w:val="0"/>
+          <w:numId w:val="37"/>
         </w:numPr>
-        <w:ind w:left="709"/>
-      </w:pPr>
-      <w:r>
-        <w:rPr>
-          <w:b/>
-          <w:bCs/>
-        </w:rPr>
-        <w:t>Add additional behavioural parameters</w:t>
-      </w:r>
-      <w:r>
-        <w:t xml:space="preserve"> (e.g. spending categories, savings goals) to allow more granular exploration of trade-offs without compromising interpretability.</w:t>
+      </w:pPr>
+      <w:r>
+        <w:rPr>
+          <w:b/>
+          <w:bCs/>
+        </w:rPr>
+        <w:t>E</w:t>
+      </w:r>
+      <w:r>
+        <w:rPr>
+          <w:b/>
+          <w:bCs/>
+        </w:rPr>
+        <w:t>vent-based or one-off expenses:</w:t>
+      </w:r>
+      <w:r>
+        <w:t xml:space="preserve"> </w:t>
+      </w:r>
+      <w:r>
+        <w:t>Support explicit modelling of one-off or shock expenses (e.g. unexpected repairs or unplanned social spending) to complement the existing stochastic variability model and represent rare but high-impact deviations from the baseline.</w:t>
       </w:r>
     </w:p>
     <w:p>
       <w:pPr>
         <w:pStyle w:val="ListParagraph"/>
         <w:numPr>
-          <w:ilvl w:val="1"/>
-          <w:numId w:val="1"/>
+          <w:ilvl w:val="0"/>
+          <w:numId w:val="37"/>
         </w:numPr>
-        <w:ind w:left="709"/>
-      </w:pPr>
-      <w:r>
-        <w:rPr>
-          <w:b/>
-          <w:bCs/>
-        </w:rPr>
-        <w:t>Explore simple ML models for pattern detection once real data is available</w:t>
-      </w:r>
-      <w:r>
-        <w:t>, particularly for identifying recurring spending behaviours. This was deliberately excluded from the current MVP due to data availability and transparency concerns.</w:t>
+      </w:pPr>
+      <w:r>
+        <w:rPr>
+          <w:b/>
+          <w:bCs/>
+        </w:rPr>
+        <w:t>Additional behavioural parameters:</w:t>
+      </w:r>
+      <w:r>
+        <w:t xml:space="preserve"> </w:t>
+      </w:r>
+      <w:r>
+        <w:t>Introduce further behavioural controls (e.g. more granular spending categories or savings goals) to allow richer exploration of trade-offs while preserving interpretability.</w:t>
       </w:r>
     </w:p>
     <w:p>
       <w:pPr>
         <w:pStyle w:val="ListParagraph"/>
         <w:numPr>
-          <w:ilvl w:val="1"/>
-          <w:numId w:val="1"/>
+          <w:ilvl w:val="0"/>
+          <w:numId w:val="37"/>
         </w:numPr>
-        <w:ind w:left="709"/>
-      </w:pPr>
-      <w:r>
-        <w:rPr>
-          <w:b/>
-          <w:bCs/>
-        </w:rPr>
-        <w:t>Enhance visualisations to show distributions more explicitly</w:t>
-      </w:r>
-      <w:r>
-        <w:t>, such as histograms or fan charts, to improve understanding of uncertainty and variability over time.</w:t>
-      </w:r>
-    </w:p>
-    <w:p>
-      <w:r>
-        <w:t>These improvements were intentionally deferred in the current project to maintain scope discipline and conceptual clarity. The priority was to validate the reasoning model before extending functionality.</w:t>
+      </w:pPr>
+      <w:r>
+        <w:rPr>
+          <w:b/>
+          <w:bCs/>
+        </w:rPr>
+        <w:t>Enhanced uncertainty visualisation:</w:t>
+      </w:r>
+      <w:r>
+        <w:t xml:space="preserve"> </w:t>
+      </w:r>
+      <w:r>
+        <w:t>Improve visual representations of uncertainty through distribution-focused plots (e.g. histograms or fan charts) to better communicate variability and outcome spread over time.</w:t>
+      </w:r>
+    </w:p>
+    <w:p>
+      <w:pPr>
+        <w:pStyle w:val="ListParagraph"/>
+        <w:numPr>
+          <w:ilvl w:val="0"/>
+          <w:numId w:val="37"/>
+        </w:numPr>
+      </w:pPr>
+      <w:r>
+        <w:rPr>
+          <w:b/>
+          <w:bCs/>
+        </w:rPr>
+        <w:t>Data-driven extensions:</w:t>
+      </w:r>
+      <w:r>
+        <w:t xml:space="preserve"> </w:t>
+      </w:r>
+      <w:r>
+        <w:t>Explore simple machine learning techniques for pattern detection once real user data becomes available, particularly for identifying recurring spending behaviours. This was deliberately excluded from the current MVP due to data availability, transparency, and ethical considerations.</w:t>
+      </w:r>
+    </w:p>
+    <w:p>
+      <w:r>
+        <w:t>These extensions are deliberately framed as post-validation enhancements rather than missing core functionality.</w:t>
       </w:r>
     </w:p>
     <w:p/>
@@ -1208,6 +1919,155 @@
 <file path=word/numbering.xml><?xml version="1.0" encoding="utf-8"?>
 <w:numbering xmlns:wpc="http://schemas.microsoft.com/office/word/2010/wordprocessingCanvas" xmlns:cx="http://schemas.microsoft.com/office/drawing/2014/chartex" xmlns:cx1="http://schemas.microsoft.com/office/drawing/2015/9/8/chartex" xmlns:cx2="http://schemas.microsoft.com/office/drawing/2015/10/21/chartex" xmlns:cx3="http://schemas.microsoft.com/office/drawing/2016/5/9/chartex" xmlns:cx4="http://schemas.microsoft.com/office/drawing/2016/5/10/chartex" xmlns:cx5="http://schemas.microsoft.com/office/drawing/2016/5/11/chartex" xmlns:cx6="http://schemas.microsoft.com/office/drawing/2016/5/12/chartex" xmlns:cx7="http://schemas.microsoft.com/office/drawing/2016/5/13/chartex" xmlns:cx8="http://schemas.microsoft.com/office/drawing/2016/5/14/chartex" xmlns:mc="http://schemas.openxmlformats.org/markup-compatibility/2006" xmlns:aink="http://schemas.microsoft.com/office/drawing/2016/ink" xmlns:am3d="http://schemas.microsoft.com/office/drawing/2017/model3d" xmlns:o="urn:schemas-microsoft-com:office:office" xmlns:oel="http://schemas.microsoft.com/office/2019/extlst" xmlns:r="http://schemas.openxmlformats.org/officeDocument/2006/relationships" xmlns:m="http://schemas.openxmlformats.org/officeDocument/2006/math" xmlns:v="urn:schemas-microsoft-com:vml" xmlns:wp14="http://schemas.microsoft.com/office/word/2010/wordprocessingDrawing" xmlns:wp="http://schemas.openxmlformats.org/drawingml/2006/wordprocessingDrawing" xmlns:w10="urn:schemas-microsoft-com:office:word" xmlns:w="http://schemas.openxmlformats.org/wordprocessingml/2006/main" xmlns:w14="http://schemas.microsoft.com/office/word/2010/wordml" xmlns:w15="http://schemas.microsoft.com/office/word/2012/wordml" xmlns:w16cex="http://schemas.microsoft.com/office/word/2018/wordml/cex" xmlns:w16cid="http://schemas.microsoft.com/office/word/2016/wordml/cid" xmlns:w16="http://schemas.microsoft.com/office/word/2018/wordml" xmlns:w16du="http://schemas.microsoft.com/office/word/2023/wordml/word16du" xmlns:w16sdtdh="http://schemas.microsoft.com/office/word/2020/wordml/sdtdatahash" xmlns:w16sdtfl="http://schemas.microsoft.com/office/word/2024/wordml/sdtformatlock" xmlns:w16se="http://schemas.microsoft.com/office/word/2015/wordml/symex" xmlns:wpg="http://schemas.microsoft.com/office/word/2010/wordprocessingGroup" xmlns:wpi="http://schemas.microsoft.com/office/word/2010/wordprocessingInk" xmlns:wne="http://schemas.microsoft.com/office/word/2006/wordml" xmlns:wps="http://schemas.microsoft.com/office/word/2010/wordprocessingShape" mc:Ignorable="w14 w15 w16se w16cid w16 w16cex w16sdtdh w16sdtfl w16du wp14">
   <w:abstractNum w:abstractNumId="0" w15:restartNumberingAfterBreak="0">
+    <w:nsid w:val="01467DCD"/>
+    <w:multiLevelType w:val="multilevel"/>
+    <w:tmpl w:val="EDC41730"/>
+    <w:lvl w:ilvl="0">
+      <w:start w:val="1"/>
+      <w:numFmt w:val="bullet"/>
+      <w:lvlText w:val=""/>
+      <w:lvlJc w:val="left"/>
+      <w:pPr>
+        <w:tabs>
+          <w:tab w:val="num" w:pos="720"/>
+        </w:tabs>
+        <w:ind w:left="720" w:hanging="360"/>
+      </w:pPr>
+      <w:rPr>
+        <w:rFonts w:ascii="Symbol" w:hAnsi="Symbol" w:hint="default"/>
+        <w:sz w:val="20"/>
+      </w:rPr>
+    </w:lvl>
+    <w:lvl w:ilvl="1" w:tentative="1">
+      <w:start w:val="1"/>
+      <w:numFmt w:val="bullet"/>
+      <w:lvlText w:val="o"/>
+      <w:lvlJc w:val="left"/>
+      <w:pPr>
+        <w:tabs>
+          <w:tab w:val="num" w:pos="1440"/>
+        </w:tabs>
+        <w:ind w:left="1440" w:hanging="360"/>
+      </w:pPr>
+      <w:rPr>
+        <w:rFonts w:ascii="Courier New" w:hAnsi="Courier New" w:hint="default"/>
+        <w:sz w:val="20"/>
+      </w:rPr>
+    </w:lvl>
+    <w:lvl w:ilvl="2" w:tentative="1">
+      <w:start w:val="1"/>
+      <w:numFmt w:val="bullet"/>
+      <w:lvlText w:val=""/>
+      <w:lvlJc w:val="left"/>
+      <w:pPr>
+        <w:tabs>
+          <w:tab w:val="num" w:pos="2160"/>
+        </w:tabs>
+        <w:ind w:left="2160" w:hanging="360"/>
+      </w:pPr>
+      <w:rPr>
+        <w:rFonts w:ascii="Wingdings" w:hAnsi="Wingdings" w:hint="default"/>
+        <w:sz w:val="20"/>
+      </w:rPr>
+    </w:lvl>
+    <w:lvl w:ilvl="3" w:tentative="1">
+      <w:start w:val="1"/>
+      <w:numFmt w:val="bullet"/>
+      <w:lvlText w:val=""/>
+      <w:lvlJc w:val="left"/>
+      <w:pPr>
+        <w:tabs>
+          <w:tab w:val="num" w:pos="2880"/>
+        </w:tabs>
+        <w:ind w:left="2880" w:hanging="360"/>
+      </w:pPr>
+      <w:rPr>
+        <w:rFonts w:ascii="Wingdings" w:hAnsi="Wingdings" w:hint="default"/>
+        <w:sz w:val="20"/>
+      </w:rPr>
+    </w:lvl>
+    <w:lvl w:ilvl="4" w:tentative="1">
+      <w:start w:val="1"/>
+      <w:numFmt w:val="bullet"/>
+      <w:lvlText w:val=""/>
+      <w:lvlJc w:val="left"/>
+      <w:pPr>
+        <w:tabs>
+          <w:tab w:val="num" w:pos="3600"/>
+        </w:tabs>
+        <w:ind w:left="3600" w:hanging="360"/>
+      </w:pPr>
+      <w:rPr>
+        <w:rFonts w:ascii="Wingdings" w:hAnsi="Wingdings" w:hint="default"/>
+        <w:sz w:val="20"/>
+      </w:rPr>
+    </w:lvl>
+    <w:lvl w:ilvl="5" w:tentative="1">
+      <w:start w:val="1"/>
+      <w:numFmt w:val="bullet"/>
+      <w:lvlText w:val=""/>
+      <w:lvlJc w:val="left"/>
+      <w:pPr>
+        <w:tabs>
+          <w:tab w:val="num" w:pos="4320"/>
+        </w:tabs>
+        <w:ind w:left="4320" w:hanging="360"/>
+      </w:pPr>
+      <w:rPr>
+        <w:rFonts w:ascii="Wingdings" w:hAnsi="Wingdings" w:hint="default"/>
+        <w:sz w:val="20"/>
+      </w:rPr>
+    </w:lvl>
+    <w:lvl w:ilvl="6" w:tentative="1">
+      <w:start w:val="1"/>
+      <w:numFmt w:val="bullet"/>
+      <w:lvlText w:val=""/>
+      <w:lvlJc w:val="left"/>
+      <w:pPr>
+        <w:tabs>
+          <w:tab w:val="num" w:pos="5040"/>
+        </w:tabs>
+        <w:ind w:left="5040" w:hanging="360"/>
+      </w:pPr>
+      <w:rPr>
+        <w:rFonts w:ascii="Wingdings" w:hAnsi="Wingdings" w:hint="default"/>
+        <w:sz w:val="20"/>
+      </w:rPr>
+    </w:lvl>
+    <w:lvl w:ilvl="7" w:tentative="1">
+      <w:start w:val="1"/>
+      <w:numFmt w:val="bullet"/>
+      <w:lvlText w:val=""/>
+      <w:lvlJc w:val="left"/>
+      <w:pPr>
+        <w:tabs>
+          <w:tab w:val="num" w:pos="5760"/>
+        </w:tabs>
+        <w:ind w:left="5760" w:hanging="360"/>
+      </w:pPr>
+      <w:rPr>
+        <w:rFonts w:ascii="Wingdings" w:hAnsi="Wingdings" w:hint="default"/>
+        <w:sz w:val="20"/>
+      </w:rPr>
+    </w:lvl>
+    <w:lvl w:ilvl="8" w:tentative="1">
+      <w:start w:val="1"/>
+      <w:numFmt w:val="bullet"/>
+      <w:lvlText w:val=""/>
+      <w:lvlJc w:val="left"/>
+      <w:pPr>
+        <w:tabs>
+          <w:tab w:val="num" w:pos="6480"/>
+        </w:tabs>
+        <w:ind w:left="6480" w:hanging="360"/>
+      </w:pPr>
+      <w:rPr>
+        <w:rFonts w:ascii="Wingdings" w:hAnsi="Wingdings" w:hint="default"/>
+        <w:sz w:val="20"/>
+      </w:rPr>
+    </w:lvl>
+  </w:abstractNum>
+  <w:abstractNum w:abstractNumId="1" w15:restartNumberingAfterBreak="0">
     <w:nsid w:val="0E1B5909"/>
     <w:multiLevelType w:val="multilevel"/>
     <w:tmpl w:val="07EA01B6"/>
@@ -1356,7 +2216,7 @@
       </w:rPr>
     </w:lvl>
   </w:abstractNum>
-  <w:abstractNum w:abstractNumId="1" w15:restartNumberingAfterBreak="0">
+  <w:abstractNum w:abstractNumId="2" w15:restartNumberingAfterBreak="0">
     <w:nsid w:val="0EC124FC"/>
     <w:multiLevelType w:val="multilevel"/>
     <w:tmpl w:val="0DB8BC22"/>
@@ -1505,7 +2365,156 @@
       </w:rPr>
     </w:lvl>
   </w:abstractNum>
-  <w:abstractNum w:abstractNumId="2" w15:restartNumberingAfterBreak="0">
+  <w:abstractNum w:abstractNumId="3" w15:restartNumberingAfterBreak="0">
+    <w:nsid w:val="14FA7C24"/>
+    <w:multiLevelType w:val="multilevel"/>
+    <w:tmpl w:val="9E5EE3B6"/>
+    <w:lvl w:ilvl="0">
+      <w:start w:val="1"/>
+      <w:numFmt w:val="bullet"/>
+      <w:lvlText w:val=""/>
+      <w:lvlJc w:val="left"/>
+      <w:pPr>
+        <w:tabs>
+          <w:tab w:val="num" w:pos="720"/>
+        </w:tabs>
+        <w:ind w:left="720" w:hanging="360"/>
+      </w:pPr>
+      <w:rPr>
+        <w:rFonts w:ascii="Symbol" w:hAnsi="Symbol" w:hint="default"/>
+        <w:sz w:val="20"/>
+      </w:rPr>
+    </w:lvl>
+    <w:lvl w:ilvl="1" w:tentative="1">
+      <w:start w:val="1"/>
+      <w:numFmt w:val="bullet"/>
+      <w:lvlText w:val="o"/>
+      <w:lvlJc w:val="left"/>
+      <w:pPr>
+        <w:tabs>
+          <w:tab w:val="num" w:pos="1440"/>
+        </w:tabs>
+        <w:ind w:left="1440" w:hanging="360"/>
+      </w:pPr>
+      <w:rPr>
+        <w:rFonts w:ascii="Courier New" w:hAnsi="Courier New" w:hint="default"/>
+        <w:sz w:val="20"/>
+      </w:rPr>
+    </w:lvl>
+    <w:lvl w:ilvl="2" w:tentative="1">
+      <w:start w:val="1"/>
+      <w:numFmt w:val="bullet"/>
+      <w:lvlText w:val=""/>
+      <w:lvlJc w:val="left"/>
+      <w:pPr>
+        <w:tabs>
+          <w:tab w:val="num" w:pos="2160"/>
+        </w:tabs>
+        <w:ind w:left="2160" w:hanging="360"/>
+      </w:pPr>
+      <w:rPr>
+        <w:rFonts w:ascii="Wingdings" w:hAnsi="Wingdings" w:hint="default"/>
+        <w:sz w:val="20"/>
+      </w:rPr>
+    </w:lvl>
+    <w:lvl w:ilvl="3" w:tentative="1">
+      <w:start w:val="1"/>
+      <w:numFmt w:val="bullet"/>
+      <w:lvlText w:val=""/>
+      <w:lvlJc w:val="left"/>
+      <w:pPr>
+        <w:tabs>
+          <w:tab w:val="num" w:pos="2880"/>
+        </w:tabs>
+        <w:ind w:left="2880" w:hanging="360"/>
+      </w:pPr>
+      <w:rPr>
+        <w:rFonts w:ascii="Wingdings" w:hAnsi="Wingdings" w:hint="default"/>
+        <w:sz w:val="20"/>
+      </w:rPr>
+    </w:lvl>
+    <w:lvl w:ilvl="4" w:tentative="1">
+      <w:start w:val="1"/>
+      <w:numFmt w:val="bullet"/>
+      <w:lvlText w:val=""/>
+      <w:lvlJc w:val="left"/>
+      <w:pPr>
+        <w:tabs>
+          <w:tab w:val="num" w:pos="3600"/>
+        </w:tabs>
+        <w:ind w:left="3600" w:hanging="360"/>
+      </w:pPr>
+      <w:rPr>
+        <w:rFonts w:ascii="Wingdings" w:hAnsi="Wingdings" w:hint="default"/>
+        <w:sz w:val="20"/>
+      </w:rPr>
+    </w:lvl>
+    <w:lvl w:ilvl="5" w:tentative="1">
+      <w:start w:val="1"/>
+      <w:numFmt w:val="bullet"/>
+      <w:lvlText w:val=""/>
+      <w:lvlJc w:val="left"/>
+      <w:pPr>
+        <w:tabs>
+          <w:tab w:val="num" w:pos="4320"/>
+        </w:tabs>
+        <w:ind w:left="4320" w:hanging="360"/>
+      </w:pPr>
+      <w:rPr>
+        <w:rFonts w:ascii="Wingdings" w:hAnsi="Wingdings" w:hint="default"/>
+        <w:sz w:val="20"/>
+      </w:rPr>
+    </w:lvl>
+    <w:lvl w:ilvl="6" w:tentative="1">
+      <w:start w:val="1"/>
+      <w:numFmt w:val="bullet"/>
+      <w:lvlText w:val=""/>
+      <w:lvlJc w:val="left"/>
+      <w:pPr>
+        <w:tabs>
+          <w:tab w:val="num" w:pos="5040"/>
+        </w:tabs>
+        <w:ind w:left="5040" w:hanging="360"/>
+      </w:pPr>
+      <w:rPr>
+        <w:rFonts w:ascii="Wingdings" w:hAnsi="Wingdings" w:hint="default"/>
+        <w:sz w:val="20"/>
+      </w:rPr>
+    </w:lvl>
+    <w:lvl w:ilvl="7" w:tentative="1">
+      <w:start w:val="1"/>
+      <w:numFmt w:val="bullet"/>
+      <w:lvlText w:val=""/>
+      <w:lvlJc w:val="left"/>
+      <w:pPr>
+        <w:tabs>
+          <w:tab w:val="num" w:pos="5760"/>
+        </w:tabs>
+        <w:ind w:left="5760" w:hanging="360"/>
+      </w:pPr>
+      <w:rPr>
+        <w:rFonts w:ascii="Wingdings" w:hAnsi="Wingdings" w:hint="default"/>
+        <w:sz w:val="20"/>
+      </w:rPr>
+    </w:lvl>
+    <w:lvl w:ilvl="8" w:tentative="1">
+      <w:start w:val="1"/>
+      <w:numFmt w:val="bullet"/>
+      <w:lvlText w:val=""/>
+      <w:lvlJc w:val="left"/>
+      <w:pPr>
+        <w:tabs>
+          <w:tab w:val="num" w:pos="6480"/>
+        </w:tabs>
+        <w:ind w:left="6480" w:hanging="360"/>
+      </w:pPr>
+      <w:rPr>
+        <w:rFonts w:ascii="Wingdings" w:hAnsi="Wingdings" w:hint="default"/>
+        <w:sz w:val="20"/>
+      </w:rPr>
+    </w:lvl>
+  </w:abstractNum>
+  <w:abstractNum w:abstractNumId="4" w15:restartNumberingAfterBreak="0">
     <w:nsid w:val="18C91B3F"/>
     <w:multiLevelType w:val="multilevel"/>
     <w:tmpl w:val="D6AAB38E"/>
@@ -1654,7 +2663,156 @@
       </w:rPr>
     </w:lvl>
   </w:abstractNum>
-  <w:abstractNum w:abstractNumId="3" w15:restartNumberingAfterBreak="0">
+  <w:abstractNum w:abstractNumId="5" w15:restartNumberingAfterBreak="0">
+    <w:nsid w:val="1B5B1C5F"/>
+    <w:multiLevelType w:val="multilevel"/>
+    <w:tmpl w:val="3438925E"/>
+    <w:lvl w:ilvl="0">
+      <w:start w:val="1"/>
+      <w:numFmt w:val="bullet"/>
+      <w:lvlText w:val=""/>
+      <w:lvlJc w:val="left"/>
+      <w:pPr>
+        <w:tabs>
+          <w:tab w:val="num" w:pos="720"/>
+        </w:tabs>
+        <w:ind w:left="720" w:hanging="360"/>
+      </w:pPr>
+      <w:rPr>
+        <w:rFonts w:ascii="Symbol" w:hAnsi="Symbol" w:hint="default"/>
+        <w:sz w:val="20"/>
+      </w:rPr>
+    </w:lvl>
+    <w:lvl w:ilvl="1" w:tentative="1">
+      <w:start w:val="1"/>
+      <w:numFmt w:val="bullet"/>
+      <w:lvlText w:val="o"/>
+      <w:lvlJc w:val="left"/>
+      <w:pPr>
+        <w:tabs>
+          <w:tab w:val="num" w:pos="1440"/>
+        </w:tabs>
+        <w:ind w:left="1440" w:hanging="360"/>
+      </w:pPr>
+      <w:rPr>
+        <w:rFonts w:ascii="Courier New" w:hAnsi="Courier New" w:hint="default"/>
+        <w:sz w:val="20"/>
+      </w:rPr>
+    </w:lvl>
+    <w:lvl w:ilvl="2" w:tentative="1">
+      <w:start w:val="1"/>
+      <w:numFmt w:val="bullet"/>
+      <w:lvlText w:val=""/>
+      <w:lvlJc w:val="left"/>
+      <w:pPr>
+        <w:tabs>
+          <w:tab w:val="num" w:pos="2160"/>
+        </w:tabs>
+        <w:ind w:left="2160" w:hanging="360"/>
+      </w:pPr>
+      <w:rPr>
+        <w:rFonts w:ascii="Wingdings" w:hAnsi="Wingdings" w:hint="default"/>
+        <w:sz w:val="20"/>
+      </w:rPr>
+    </w:lvl>
+    <w:lvl w:ilvl="3" w:tentative="1">
+      <w:start w:val="1"/>
+      <w:numFmt w:val="bullet"/>
+      <w:lvlText w:val=""/>
+      <w:lvlJc w:val="left"/>
+      <w:pPr>
+        <w:tabs>
+          <w:tab w:val="num" w:pos="2880"/>
+        </w:tabs>
+        <w:ind w:left="2880" w:hanging="360"/>
+      </w:pPr>
+      <w:rPr>
+        <w:rFonts w:ascii="Wingdings" w:hAnsi="Wingdings" w:hint="default"/>
+        <w:sz w:val="20"/>
+      </w:rPr>
+    </w:lvl>
+    <w:lvl w:ilvl="4" w:tentative="1">
+      <w:start w:val="1"/>
+      <w:numFmt w:val="bullet"/>
+      <w:lvlText w:val=""/>
+      <w:lvlJc w:val="left"/>
+      <w:pPr>
+        <w:tabs>
+          <w:tab w:val="num" w:pos="3600"/>
+        </w:tabs>
+        <w:ind w:left="3600" w:hanging="360"/>
+      </w:pPr>
+      <w:rPr>
+        <w:rFonts w:ascii="Wingdings" w:hAnsi="Wingdings" w:hint="default"/>
+        <w:sz w:val="20"/>
+      </w:rPr>
+    </w:lvl>
+    <w:lvl w:ilvl="5" w:tentative="1">
+      <w:start w:val="1"/>
+      <w:numFmt w:val="bullet"/>
+      <w:lvlText w:val=""/>
+      <w:lvlJc w:val="left"/>
+      <w:pPr>
+        <w:tabs>
+          <w:tab w:val="num" w:pos="4320"/>
+        </w:tabs>
+        <w:ind w:left="4320" w:hanging="360"/>
+      </w:pPr>
+      <w:rPr>
+        <w:rFonts w:ascii="Wingdings" w:hAnsi="Wingdings" w:hint="default"/>
+        <w:sz w:val="20"/>
+      </w:rPr>
+    </w:lvl>
+    <w:lvl w:ilvl="6" w:tentative="1">
+      <w:start w:val="1"/>
+      <w:numFmt w:val="bullet"/>
+      <w:lvlText w:val=""/>
+      <w:lvlJc w:val="left"/>
+      <w:pPr>
+        <w:tabs>
+          <w:tab w:val="num" w:pos="5040"/>
+        </w:tabs>
+        <w:ind w:left="5040" w:hanging="360"/>
+      </w:pPr>
+      <w:rPr>
+        <w:rFonts w:ascii="Wingdings" w:hAnsi="Wingdings" w:hint="default"/>
+        <w:sz w:val="20"/>
+      </w:rPr>
+    </w:lvl>
+    <w:lvl w:ilvl="7" w:tentative="1">
+      <w:start w:val="1"/>
+      <w:numFmt w:val="bullet"/>
+      <w:lvlText w:val=""/>
+      <w:lvlJc w:val="left"/>
+      <w:pPr>
+        <w:tabs>
+          <w:tab w:val="num" w:pos="5760"/>
+        </w:tabs>
+        <w:ind w:left="5760" w:hanging="360"/>
+      </w:pPr>
+      <w:rPr>
+        <w:rFonts w:ascii="Wingdings" w:hAnsi="Wingdings" w:hint="default"/>
+        <w:sz w:val="20"/>
+      </w:rPr>
+    </w:lvl>
+    <w:lvl w:ilvl="8" w:tentative="1">
+      <w:start w:val="1"/>
+      <w:numFmt w:val="bullet"/>
+      <w:lvlText w:val=""/>
+      <w:lvlJc w:val="left"/>
+      <w:pPr>
+        <w:tabs>
+          <w:tab w:val="num" w:pos="6480"/>
+        </w:tabs>
+        <w:ind w:left="6480" w:hanging="360"/>
+      </w:pPr>
+      <w:rPr>
+        <w:rFonts w:ascii="Wingdings" w:hAnsi="Wingdings" w:hint="default"/>
+        <w:sz w:val="20"/>
+      </w:rPr>
+    </w:lvl>
+  </w:abstractNum>
+  <w:abstractNum w:abstractNumId="6" w15:restartNumberingAfterBreak="0">
     <w:nsid w:val="1CBB6AC7"/>
     <w:multiLevelType w:val="hybridMultilevel"/>
     <w:tmpl w:val="47422F6E"/>
@@ -1767,7 +2925,7 @@
       </w:rPr>
     </w:lvl>
   </w:abstractNum>
-  <w:abstractNum w:abstractNumId="4" w15:restartNumberingAfterBreak="0">
+  <w:abstractNum w:abstractNumId="7" w15:restartNumberingAfterBreak="0">
     <w:nsid w:val="204B08A5"/>
     <w:multiLevelType w:val="multilevel"/>
     <w:tmpl w:val="A628B89E"/>
@@ -1916,7 +3074,7 @@
       </w:rPr>
     </w:lvl>
   </w:abstractNum>
-  <w:abstractNum w:abstractNumId="5" w15:restartNumberingAfterBreak="0">
+  <w:abstractNum w:abstractNumId="8" w15:restartNumberingAfterBreak="0">
     <w:nsid w:val="217B151D"/>
     <w:multiLevelType w:val="hybridMultilevel"/>
     <w:tmpl w:val="46049008"/>
@@ -2029,7 +3187,7 @@
       </w:rPr>
     </w:lvl>
   </w:abstractNum>
-  <w:abstractNum w:abstractNumId="6" w15:restartNumberingAfterBreak="0">
+  <w:abstractNum w:abstractNumId="9" w15:restartNumberingAfterBreak="0">
     <w:nsid w:val="2B7575D9"/>
     <w:multiLevelType w:val="multilevel"/>
     <w:tmpl w:val="9AECE0F2"/>
@@ -2178,7 +3336,7 @@
       </w:rPr>
     </w:lvl>
   </w:abstractNum>
-  <w:abstractNum w:abstractNumId="7" w15:restartNumberingAfterBreak="0">
+  <w:abstractNum w:abstractNumId="10" w15:restartNumberingAfterBreak="0">
     <w:nsid w:val="2E372BBC"/>
     <w:multiLevelType w:val="multilevel"/>
     <w:tmpl w:val="EB583CBA"/>
@@ -2327,7 +3485,7 @@
       </w:rPr>
     </w:lvl>
   </w:abstractNum>
-  <w:abstractNum w:abstractNumId="8" w15:restartNumberingAfterBreak="0">
+  <w:abstractNum w:abstractNumId="11" w15:restartNumberingAfterBreak="0">
     <w:nsid w:val="3006106A"/>
     <w:multiLevelType w:val="hybridMultilevel"/>
     <w:tmpl w:val="A56EF55A"/>
@@ -2440,7 +3598,7 @@
       </w:rPr>
     </w:lvl>
   </w:abstractNum>
-  <w:abstractNum w:abstractNumId="9" w15:restartNumberingAfterBreak="0">
+  <w:abstractNum w:abstractNumId="12" w15:restartNumberingAfterBreak="0">
     <w:nsid w:val="31500DBA"/>
     <w:multiLevelType w:val="multilevel"/>
     <w:tmpl w:val="A7C0F2AC"/>
@@ -2589,7 +3747,7 @@
       </w:rPr>
     </w:lvl>
   </w:abstractNum>
-  <w:abstractNum w:abstractNumId="10" w15:restartNumberingAfterBreak="0">
+  <w:abstractNum w:abstractNumId="13" w15:restartNumberingAfterBreak="0">
     <w:nsid w:val="32505191"/>
     <w:multiLevelType w:val="hybridMultilevel"/>
     <w:tmpl w:val="DB7821C4"/>
@@ -2702,7 +3860,7 @@
       </w:rPr>
     </w:lvl>
   </w:abstractNum>
-  <w:abstractNum w:abstractNumId="11" w15:restartNumberingAfterBreak="0">
+  <w:abstractNum w:abstractNumId="14" w15:restartNumberingAfterBreak="0">
     <w:nsid w:val="35CA4D7E"/>
     <w:multiLevelType w:val="multilevel"/>
     <w:tmpl w:val="2B3ABA72"/>
@@ -2851,7 +4009,7 @@
       </w:rPr>
     </w:lvl>
   </w:abstractNum>
-  <w:abstractNum w:abstractNumId="12" w15:restartNumberingAfterBreak="0">
+  <w:abstractNum w:abstractNumId="15" w15:restartNumberingAfterBreak="0">
     <w:nsid w:val="38E9022C"/>
     <w:multiLevelType w:val="multilevel"/>
     <w:tmpl w:val="E18E857E"/>
@@ -3000,7 +4158,120 @@
       </w:rPr>
     </w:lvl>
   </w:abstractNum>
-  <w:abstractNum w:abstractNumId="13" w15:restartNumberingAfterBreak="0">
+  <w:abstractNum w:abstractNumId="16" w15:restartNumberingAfterBreak="0">
+    <w:nsid w:val="3E383DD8"/>
+    <w:multiLevelType w:val="hybridMultilevel"/>
+    <w:tmpl w:val="AF68DA84"/>
+    <w:lvl w:ilvl="0" w:tplc="08090001">
+      <w:start w:val="1"/>
+      <w:numFmt w:val="bullet"/>
+      <w:lvlText w:val=""/>
+      <w:lvlJc w:val="left"/>
+      <w:pPr>
+        <w:ind w:left="720" w:hanging="360"/>
+      </w:pPr>
+      <w:rPr>
+        <w:rFonts w:ascii="Symbol" w:hAnsi="Symbol" w:hint="default"/>
+      </w:rPr>
+    </w:lvl>
+    <w:lvl w:ilvl="1" w:tplc="08090003" w:tentative="1">
+      <w:start w:val="1"/>
+      <w:numFmt w:val="bullet"/>
+      <w:lvlText w:val="o"/>
+      <w:lvlJc w:val="left"/>
+      <w:pPr>
+        <w:ind w:left="1440" w:hanging="360"/>
+      </w:pPr>
+      <w:rPr>
+        <w:rFonts w:ascii="Courier New" w:hAnsi="Courier New" w:cs="Courier New" w:hint="default"/>
+      </w:rPr>
+    </w:lvl>
+    <w:lvl w:ilvl="2" w:tplc="08090005" w:tentative="1">
+      <w:start w:val="1"/>
+      <w:numFmt w:val="bullet"/>
+      <w:lvlText w:val=""/>
+      <w:lvlJc w:val="left"/>
+      <w:pPr>
+        <w:ind w:left="2160" w:hanging="360"/>
+      </w:pPr>
+      <w:rPr>
+        <w:rFonts w:ascii="Wingdings" w:hAnsi="Wingdings" w:hint="default"/>
+      </w:rPr>
+    </w:lvl>
+    <w:lvl w:ilvl="3" w:tplc="08090001" w:tentative="1">
+      <w:start w:val="1"/>
+      <w:numFmt w:val="bullet"/>
+      <w:lvlText w:val=""/>
+      <w:lvlJc w:val="left"/>
+      <w:pPr>
+        <w:ind w:left="2880" w:hanging="360"/>
+      </w:pPr>
+      <w:rPr>
+        <w:rFonts w:ascii="Symbol" w:hAnsi="Symbol" w:hint="default"/>
+      </w:rPr>
+    </w:lvl>
+    <w:lvl w:ilvl="4" w:tplc="08090003" w:tentative="1">
+      <w:start w:val="1"/>
+      <w:numFmt w:val="bullet"/>
+      <w:lvlText w:val="o"/>
+      <w:lvlJc w:val="left"/>
+      <w:pPr>
+        <w:ind w:left="3600" w:hanging="360"/>
+      </w:pPr>
+      <w:rPr>
+        <w:rFonts w:ascii="Courier New" w:hAnsi="Courier New" w:cs="Courier New" w:hint="default"/>
+      </w:rPr>
+    </w:lvl>
+    <w:lvl w:ilvl="5" w:tplc="08090005" w:tentative="1">
+      <w:start w:val="1"/>
+      <w:numFmt w:val="bullet"/>
+      <w:lvlText w:val=""/>
+      <w:lvlJc w:val="left"/>
+      <w:pPr>
+        <w:ind w:left="4320" w:hanging="360"/>
+      </w:pPr>
+      <w:rPr>
+        <w:rFonts w:ascii="Wingdings" w:hAnsi="Wingdings" w:hint="default"/>
+      </w:rPr>
+    </w:lvl>
+    <w:lvl w:ilvl="6" w:tplc="08090001" w:tentative="1">
+      <w:start w:val="1"/>
+      <w:numFmt w:val="bullet"/>
+      <w:lvlText w:val=""/>
+      <w:lvlJc w:val="left"/>
+      <w:pPr>
+        <w:ind w:left="5040" w:hanging="360"/>
+      </w:pPr>
+      <w:rPr>
+        <w:rFonts w:ascii="Symbol" w:hAnsi="Symbol" w:hint="default"/>
+      </w:rPr>
+    </w:lvl>
+    <w:lvl w:ilvl="7" w:tplc="08090003" w:tentative="1">
+      <w:start w:val="1"/>
+      <w:numFmt w:val="bullet"/>
+      <w:lvlText w:val="o"/>
+      <w:lvlJc w:val="left"/>
+      <w:pPr>
+        <w:ind w:left="5760" w:hanging="360"/>
+      </w:pPr>
+      <w:rPr>
+        <w:rFonts w:ascii="Courier New" w:hAnsi="Courier New" w:cs="Courier New" w:hint="default"/>
+      </w:rPr>
+    </w:lvl>
+    <w:lvl w:ilvl="8" w:tplc="08090005" w:tentative="1">
+      <w:start w:val="1"/>
+      <w:numFmt w:val="bullet"/>
+      <w:lvlText w:val=""/>
+      <w:lvlJc w:val="left"/>
+      <w:pPr>
+        <w:ind w:left="6480" w:hanging="360"/>
+      </w:pPr>
+      <w:rPr>
+        <w:rFonts w:ascii="Wingdings" w:hAnsi="Wingdings" w:hint="default"/>
+      </w:rPr>
+    </w:lvl>
+  </w:abstractNum>
+  <w:abstractNum w:abstractNumId="17" w15:restartNumberingAfterBreak="0">
     <w:nsid w:val="44C20D08"/>
     <w:multiLevelType w:val="multilevel"/>
     <w:tmpl w:val="5C06E404"/>
@@ -3149,7 +4420,7 @@
       </w:rPr>
     </w:lvl>
   </w:abstractNum>
-  <w:abstractNum w:abstractNumId="14" w15:restartNumberingAfterBreak="0">
+  <w:abstractNum w:abstractNumId="18" w15:restartNumberingAfterBreak="0">
     <w:nsid w:val="4AEC76E2"/>
     <w:multiLevelType w:val="hybridMultilevel"/>
     <w:tmpl w:val="41E07E16"/>
@@ -3262,7 +4533,7 @@
       </w:rPr>
     </w:lvl>
   </w:abstractNum>
-  <w:abstractNum w:abstractNumId="15" w15:restartNumberingAfterBreak="0">
+  <w:abstractNum w:abstractNumId="19" w15:restartNumberingAfterBreak="0">
     <w:nsid w:val="4D851A20"/>
     <w:multiLevelType w:val="multilevel"/>
     <w:tmpl w:val="DB026BC0"/>
@@ -3411,7 +4682,7 @@
       </w:rPr>
     </w:lvl>
   </w:abstractNum>
-  <w:abstractNum w:abstractNumId="16" w15:restartNumberingAfterBreak="0">
+  <w:abstractNum w:abstractNumId="20" w15:restartNumberingAfterBreak="0">
     <w:nsid w:val="50EC3FD1"/>
     <w:multiLevelType w:val="multilevel"/>
     <w:tmpl w:val="CA467C3C"/>
@@ -3560,7 +4831,7 @@
       </w:rPr>
     </w:lvl>
   </w:abstractNum>
-  <w:abstractNum w:abstractNumId="17" w15:restartNumberingAfterBreak="0">
+  <w:abstractNum w:abstractNumId="21" w15:restartNumberingAfterBreak="0">
     <w:nsid w:val="51AC671B"/>
     <w:multiLevelType w:val="multilevel"/>
     <w:tmpl w:val="883E15F6"/>
@@ -3709,7 +4980,7 @@
       </w:rPr>
     </w:lvl>
   </w:abstractNum>
-  <w:abstractNum w:abstractNumId="18" w15:restartNumberingAfterBreak="0">
+  <w:abstractNum w:abstractNumId="22" w15:restartNumberingAfterBreak="0">
     <w:nsid w:val="552420AA"/>
     <w:multiLevelType w:val="hybridMultilevel"/>
     <w:tmpl w:val="A400028A"/>
@@ -3822,7 +5093,7 @@
       </w:rPr>
     </w:lvl>
   </w:abstractNum>
-  <w:abstractNum w:abstractNumId="19" w15:restartNumberingAfterBreak="0">
+  <w:abstractNum w:abstractNumId="23" w15:restartNumberingAfterBreak="0">
     <w:nsid w:val="60B961AB"/>
     <w:multiLevelType w:val="multilevel"/>
     <w:tmpl w:val="7108A7AA"/>
@@ -3971,7 +5242,156 @@
       </w:rPr>
     </w:lvl>
   </w:abstractNum>
-  <w:abstractNum w:abstractNumId="20" w15:restartNumberingAfterBreak="0">
+  <w:abstractNum w:abstractNumId="24" w15:restartNumberingAfterBreak="0">
+    <w:nsid w:val="631F7273"/>
+    <w:multiLevelType w:val="multilevel"/>
+    <w:tmpl w:val="D9AE6E10"/>
+    <w:lvl w:ilvl="0">
+      <w:start w:val="1"/>
+      <w:numFmt w:val="bullet"/>
+      <w:lvlText w:val=""/>
+      <w:lvlJc w:val="left"/>
+      <w:pPr>
+        <w:tabs>
+          <w:tab w:val="num" w:pos="720"/>
+        </w:tabs>
+        <w:ind w:left="720" w:hanging="360"/>
+      </w:pPr>
+      <w:rPr>
+        <w:rFonts w:ascii="Symbol" w:hAnsi="Symbol" w:hint="default"/>
+        <w:sz w:val="20"/>
+      </w:rPr>
+    </w:lvl>
+    <w:lvl w:ilvl="1" w:tentative="1">
+      <w:start w:val="1"/>
+      <w:numFmt w:val="bullet"/>
+      <w:lvlText w:val="o"/>
+      <w:lvlJc w:val="left"/>
+      <w:pPr>
+        <w:tabs>
+          <w:tab w:val="num" w:pos="1440"/>
+        </w:tabs>
+        <w:ind w:left="1440" w:hanging="360"/>
+      </w:pPr>
+      <w:rPr>
+        <w:rFonts w:ascii="Courier New" w:hAnsi="Courier New" w:hint="default"/>
+        <w:sz w:val="20"/>
+      </w:rPr>
+    </w:lvl>
+    <w:lvl w:ilvl="2" w:tentative="1">
+      <w:start w:val="1"/>
+      <w:numFmt w:val="bullet"/>
+      <w:lvlText w:val=""/>
+      <w:lvlJc w:val="left"/>
+      <w:pPr>
+        <w:tabs>
+          <w:tab w:val="num" w:pos="2160"/>
+        </w:tabs>
+        <w:ind w:left="2160" w:hanging="360"/>
+      </w:pPr>
+      <w:rPr>
+        <w:rFonts w:ascii="Wingdings" w:hAnsi="Wingdings" w:hint="default"/>
+        <w:sz w:val="20"/>
+      </w:rPr>
+    </w:lvl>
+    <w:lvl w:ilvl="3" w:tentative="1">
+      <w:start w:val="1"/>
+      <w:numFmt w:val="bullet"/>
+      <w:lvlText w:val=""/>
+      <w:lvlJc w:val="left"/>
+      <w:pPr>
+        <w:tabs>
+          <w:tab w:val="num" w:pos="2880"/>
+        </w:tabs>
+        <w:ind w:left="2880" w:hanging="360"/>
+      </w:pPr>
+      <w:rPr>
+        <w:rFonts w:ascii="Wingdings" w:hAnsi="Wingdings" w:hint="default"/>
+        <w:sz w:val="20"/>
+      </w:rPr>
+    </w:lvl>
+    <w:lvl w:ilvl="4" w:tentative="1">
+      <w:start w:val="1"/>
+      <w:numFmt w:val="bullet"/>
+      <w:lvlText w:val=""/>
+      <w:lvlJc w:val="left"/>
+      <w:pPr>
+        <w:tabs>
+          <w:tab w:val="num" w:pos="3600"/>
+        </w:tabs>
+        <w:ind w:left="3600" w:hanging="360"/>
+      </w:pPr>
+      <w:rPr>
+        <w:rFonts w:ascii="Wingdings" w:hAnsi="Wingdings" w:hint="default"/>
+        <w:sz w:val="20"/>
+      </w:rPr>
+    </w:lvl>
+    <w:lvl w:ilvl="5" w:tentative="1">
+      <w:start w:val="1"/>
+      <w:numFmt w:val="bullet"/>
+      <w:lvlText w:val=""/>
+      <w:lvlJc w:val="left"/>
+      <w:pPr>
+        <w:tabs>
+          <w:tab w:val="num" w:pos="4320"/>
+        </w:tabs>
+        <w:ind w:left="4320" w:hanging="360"/>
+      </w:pPr>
+      <w:rPr>
+        <w:rFonts w:ascii="Wingdings" w:hAnsi="Wingdings" w:hint="default"/>
+        <w:sz w:val="20"/>
+      </w:rPr>
+    </w:lvl>
+    <w:lvl w:ilvl="6" w:tentative="1">
+      <w:start w:val="1"/>
+      <w:numFmt w:val="bullet"/>
+      <w:lvlText w:val=""/>
+      <w:lvlJc w:val="left"/>
+      <w:pPr>
+        <w:tabs>
+          <w:tab w:val="num" w:pos="5040"/>
+        </w:tabs>
+        <w:ind w:left="5040" w:hanging="360"/>
+      </w:pPr>
+      <w:rPr>
+        <w:rFonts w:ascii="Wingdings" w:hAnsi="Wingdings" w:hint="default"/>
+        <w:sz w:val="20"/>
+      </w:rPr>
+    </w:lvl>
+    <w:lvl w:ilvl="7" w:tentative="1">
+      <w:start w:val="1"/>
+      <w:numFmt w:val="bullet"/>
+      <w:lvlText w:val=""/>
+      <w:lvlJc w:val="left"/>
+      <w:pPr>
+        <w:tabs>
+          <w:tab w:val="num" w:pos="5760"/>
+        </w:tabs>
+        <w:ind w:left="5760" w:hanging="360"/>
+      </w:pPr>
+      <w:rPr>
+        <w:rFonts w:ascii="Wingdings" w:hAnsi="Wingdings" w:hint="default"/>
+        <w:sz w:val="20"/>
+      </w:rPr>
+    </w:lvl>
+    <w:lvl w:ilvl="8" w:tentative="1">
+      <w:start w:val="1"/>
+      <w:numFmt w:val="bullet"/>
+      <w:lvlText w:val=""/>
+      <w:lvlJc w:val="left"/>
+      <w:pPr>
+        <w:tabs>
+          <w:tab w:val="num" w:pos="6480"/>
+        </w:tabs>
+        <w:ind w:left="6480" w:hanging="360"/>
+      </w:pPr>
+      <w:rPr>
+        <w:rFonts w:ascii="Wingdings" w:hAnsi="Wingdings" w:hint="default"/>
+        <w:sz w:val="20"/>
+      </w:rPr>
+    </w:lvl>
+  </w:abstractNum>
+  <w:abstractNum w:abstractNumId="25" w15:restartNumberingAfterBreak="0">
     <w:nsid w:val="66D678BF"/>
     <w:multiLevelType w:val="multilevel"/>
     <w:tmpl w:val="1990F882"/>
@@ -4120,7 +5540,120 @@
       </w:rPr>
     </w:lvl>
   </w:abstractNum>
-  <w:abstractNum w:abstractNumId="21" w15:restartNumberingAfterBreak="0">
+  <w:abstractNum w:abstractNumId="26" w15:restartNumberingAfterBreak="0">
+    <w:nsid w:val="66F347E2"/>
+    <w:multiLevelType w:val="hybridMultilevel"/>
+    <w:tmpl w:val="DD383C90"/>
+    <w:lvl w:ilvl="0" w:tplc="08090001">
+      <w:start w:val="1"/>
+      <w:numFmt w:val="bullet"/>
+      <w:lvlText w:val=""/>
+      <w:lvlJc w:val="left"/>
+      <w:pPr>
+        <w:ind w:left="1080" w:hanging="360"/>
+      </w:pPr>
+      <w:rPr>
+        <w:rFonts w:ascii="Symbol" w:hAnsi="Symbol" w:hint="default"/>
+      </w:rPr>
+    </w:lvl>
+    <w:lvl w:ilvl="1" w:tplc="08090003" w:tentative="1">
+      <w:start w:val="1"/>
+      <w:numFmt w:val="bullet"/>
+      <w:lvlText w:val="o"/>
+      <w:lvlJc w:val="left"/>
+      <w:pPr>
+        <w:ind w:left="1800" w:hanging="360"/>
+      </w:pPr>
+      <w:rPr>
+        <w:rFonts w:ascii="Courier New" w:hAnsi="Courier New" w:cs="Courier New" w:hint="default"/>
+      </w:rPr>
+    </w:lvl>
+    <w:lvl w:ilvl="2" w:tplc="08090005" w:tentative="1">
+      <w:start w:val="1"/>
+      <w:numFmt w:val="bullet"/>
+      <w:lvlText w:val=""/>
+      <w:lvlJc w:val="left"/>
+      <w:pPr>
+        <w:ind w:left="2520" w:hanging="360"/>
+      </w:pPr>
+      <w:rPr>
+        <w:rFonts w:ascii="Wingdings" w:hAnsi="Wingdings" w:hint="default"/>
+      </w:rPr>
+    </w:lvl>
+    <w:lvl w:ilvl="3" w:tplc="08090001" w:tentative="1">
+      <w:start w:val="1"/>
+      <w:numFmt w:val="bullet"/>
+      <w:lvlText w:val=""/>
+      <w:lvlJc w:val="left"/>
+      <w:pPr>
+        <w:ind w:left="3240" w:hanging="360"/>
+      </w:pPr>
+      <w:rPr>
+        <w:rFonts w:ascii="Symbol" w:hAnsi="Symbol" w:hint="default"/>
+      </w:rPr>
+    </w:lvl>
+    <w:lvl w:ilvl="4" w:tplc="08090003" w:tentative="1">
+      <w:start w:val="1"/>
+      <w:numFmt w:val="bullet"/>
+      <w:lvlText w:val="o"/>
+      <w:lvlJc w:val="left"/>
+      <w:pPr>
+        <w:ind w:left="3960" w:hanging="360"/>
+      </w:pPr>
+      <w:rPr>
+        <w:rFonts w:ascii="Courier New" w:hAnsi="Courier New" w:cs="Courier New" w:hint="default"/>
+      </w:rPr>
+    </w:lvl>
+    <w:lvl w:ilvl="5" w:tplc="08090005" w:tentative="1">
+      <w:start w:val="1"/>
+      <w:numFmt w:val="bullet"/>
+      <w:lvlText w:val=""/>
+      <w:lvlJc w:val="left"/>
+      <w:pPr>
+        <w:ind w:left="4680" w:hanging="360"/>
+      </w:pPr>
+      <w:rPr>
+        <w:rFonts w:ascii="Wingdings" w:hAnsi="Wingdings" w:hint="default"/>
+      </w:rPr>
+    </w:lvl>
+    <w:lvl w:ilvl="6" w:tplc="08090001" w:tentative="1">
+      <w:start w:val="1"/>
+      <w:numFmt w:val="bullet"/>
+      <w:lvlText w:val=""/>
+      <w:lvlJc w:val="left"/>
+      <w:pPr>
+        <w:ind w:left="5400" w:hanging="360"/>
+      </w:pPr>
+      <w:rPr>
+        <w:rFonts w:ascii="Symbol" w:hAnsi="Symbol" w:hint="default"/>
+      </w:rPr>
+    </w:lvl>
+    <w:lvl w:ilvl="7" w:tplc="08090003" w:tentative="1">
+      <w:start w:val="1"/>
+      <w:numFmt w:val="bullet"/>
+      <w:lvlText w:val="o"/>
+      <w:lvlJc w:val="left"/>
+      <w:pPr>
+        <w:ind w:left="6120" w:hanging="360"/>
+      </w:pPr>
+      <w:rPr>
+        <w:rFonts w:ascii="Courier New" w:hAnsi="Courier New" w:cs="Courier New" w:hint="default"/>
+      </w:rPr>
+    </w:lvl>
+    <w:lvl w:ilvl="8" w:tplc="08090005" w:tentative="1">
+      <w:start w:val="1"/>
+      <w:numFmt w:val="bullet"/>
+      <w:lvlText w:val=""/>
+      <w:lvlJc w:val="left"/>
+      <w:pPr>
+        <w:ind w:left="6840" w:hanging="360"/>
+      </w:pPr>
+      <w:rPr>
+        <w:rFonts w:ascii="Wingdings" w:hAnsi="Wingdings" w:hint="default"/>
+      </w:rPr>
+    </w:lvl>
+  </w:abstractNum>
+  <w:abstractNum w:abstractNumId="27" w15:restartNumberingAfterBreak="0">
     <w:nsid w:val="6A0C0E4E"/>
     <w:multiLevelType w:val="multilevel"/>
     <w:tmpl w:val="DAFA6870"/>
@@ -4269,7 +5802,120 @@
       </w:rPr>
     </w:lvl>
   </w:abstractNum>
-  <w:abstractNum w:abstractNumId="22" w15:restartNumberingAfterBreak="0">
+  <w:abstractNum w:abstractNumId="28" w15:restartNumberingAfterBreak="0">
+    <w:nsid w:val="6C1A752C"/>
+    <w:multiLevelType w:val="hybridMultilevel"/>
+    <w:tmpl w:val="B9627630"/>
+    <w:lvl w:ilvl="0" w:tplc="08090001">
+      <w:start w:val="1"/>
+      <w:numFmt w:val="bullet"/>
+      <w:lvlText w:val=""/>
+      <w:lvlJc w:val="left"/>
+      <w:pPr>
+        <w:ind w:left="1080" w:hanging="360"/>
+      </w:pPr>
+      <w:rPr>
+        <w:rFonts w:ascii="Symbol" w:hAnsi="Symbol" w:hint="default"/>
+      </w:rPr>
+    </w:lvl>
+    <w:lvl w:ilvl="1" w:tplc="08090003" w:tentative="1">
+      <w:start w:val="1"/>
+      <w:numFmt w:val="bullet"/>
+      <w:lvlText w:val="o"/>
+      <w:lvlJc w:val="left"/>
+      <w:pPr>
+        <w:ind w:left="1800" w:hanging="360"/>
+      </w:pPr>
+      <w:rPr>
+        <w:rFonts w:ascii="Courier New" w:hAnsi="Courier New" w:cs="Courier New" w:hint="default"/>
+      </w:rPr>
+    </w:lvl>
+    <w:lvl w:ilvl="2" w:tplc="08090005" w:tentative="1">
+      <w:start w:val="1"/>
+      <w:numFmt w:val="bullet"/>
+      <w:lvlText w:val=""/>
+      <w:lvlJc w:val="left"/>
+      <w:pPr>
+        <w:ind w:left="2520" w:hanging="360"/>
+      </w:pPr>
+      <w:rPr>
+        <w:rFonts w:ascii="Wingdings" w:hAnsi="Wingdings" w:hint="default"/>
+      </w:rPr>
+    </w:lvl>
+    <w:lvl w:ilvl="3" w:tplc="08090001" w:tentative="1">
+      <w:start w:val="1"/>
+      <w:numFmt w:val="bullet"/>
+      <w:lvlText w:val=""/>
+      <w:lvlJc w:val="left"/>
+      <w:pPr>
+        <w:ind w:left="3240" w:hanging="360"/>
+      </w:pPr>
+      <w:rPr>
+        <w:rFonts w:ascii="Symbol" w:hAnsi="Symbol" w:hint="default"/>
+      </w:rPr>
+    </w:lvl>
+    <w:lvl w:ilvl="4" w:tplc="08090003" w:tentative="1">
+      <w:start w:val="1"/>
+      <w:numFmt w:val="bullet"/>
+      <w:lvlText w:val="o"/>
+      <w:lvlJc w:val="left"/>
+      <w:pPr>
+        <w:ind w:left="3960" w:hanging="360"/>
+      </w:pPr>
+      <w:rPr>
+        <w:rFonts w:ascii="Courier New" w:hAnsi="Courier New" w:cs="Courier New" w:hint="default"/>
+      </w:rPr>
+    </w:lvl>
+    <w:lvl w:ilvl="5" w:tplc="08090005" w:tentative="1">
+      <w:start w:val="1"/>
+      <w:numFmt w:val="bullet"/>
+      <w:lvlText w:val=""/>
+      <w:lvlJc w:val="left"/>
+      <w:pPr>
+        <w:ind w:left="4680" w:hanging="360"/>
+      </w:pPr>
+      <w:rPr>
+        <w:rFonts w:ascii="Wingdings" w:hAnsi="Wingdings" w:hint="default"/>
+      </w:rPr>
+    </w:lvl>
+    <w:lvl w:ilvl="6" w:tplc="08090001" w:tentative="1">
+      <w:start w:val="1"/>
+      <w:numFmt w:val="bullet"/>
+      <w:lvlText w:val=""/>
+      <w:lvlJc w:val="left"/>
+      <w:pPr>
+        <w:ind w:left="5400" w:hanging="360"/>
+      </w:pPr>
+      <w:rPr>
+        <w:rFonts w:ascii="Symbol" w:hAnsi="Symbol" w:hint="default"/>
+      </w:rPr>
+    </w:lvl>
+    <w:lvl w:ilvl="7" w:tplc="08090003" w:tentative="1">
+      <w:start w:val="1"/>
+      <w:numFmt w:val="bullet"/>
+      <w:lvlText w:val="o"/>
+      <w:lvlJc w:val="left"/>
+      <w:pPr>
+        <w:ind w:left="6120" w:hanging="360"/>
+      </w:pPr>
+      <w:rPr>
+        <w:rFonts w:ascii="Courier New" w:hAnsi="Courier New" w:cs="Courier New" w:hint="default"/>
+      </w:rPr>
+    </w:lvl>
+    <w:lvl w:ilvl="8" w:tplc="08090005" w:tentative="1">
+      <w:start w:val="1"/>
+      <w:numFmt w:val="bullet"/>
+      <w:lvlText w:val=""/>
+      <w:lvlJc w:val="left"/>
+      <w:pPr>
+        <w:ind w:left="6840" w:hanging="360"/>
+      </w:pPr>
+      <w:rPr>
+        <w:rFonts w:ascii="Wingdings" w:hAnsi="Wingdings" w:hint="default"/>
+      </w:rPr>
+    </w:lvl>
+  </w:abstractNum>
+  <w:abstractNum w:abstractNumId="29" w15:restartNumberingAfterBreak="0">
     <w:nsid w:val="6C507580"/>
     <w:multiLevelType w:val="multilevel"/>
     <w:tmpl w:val="0A50F36A"/>
@@ -4418,7 +6064,120 @@
       </w:rPr>
     </w:lvl>
   </w:abstractNum>
-  <w:abstractNum w:abstractNumId="23" w15:restartNumberingAfterBreak="0">
+  <w:abstractNum w:abstractNumId="30" w15:restartNumberingAfterBreak="0">
+    <w:nsid w:val="6C862D9E"/>
+    <w:multiLevelType w:val="hybridMultilevel"/>
+    <w:tmpl w:val="986CDCB6"/>
+    <w:lvl w:ilvl="0" w:tplc="08090001">
+      <w:start w:val="1"/>
+      <w:numFmt w:val="bullet"/>
+      <w:lvlText w:val=""/>
+      <w:lvlJc w:val="left"/>
+      <w:pPr>
+        <w:ind w:left="1080" w:hanging="360"/>
+      </w:pPr>
+      <w:rPr>
+        <w:rFonts w:ascii="Symbol" w:hAnsi="Symbol" w:hint="default"/>
+      </w:rPr>
+    </w:lvl>
+    <w:lvl w:ilvl="1" w:tplc="08090003" w:tentative="1">
+      <w:start w:val="1"/>
+      <w:numFmt w:val="bullet"/>
+      <w:lvlText w:val="o"/>
+      <w:lvlJc w:val="left"/>
+      <w:pPr>
+        <w:ind w:left="1800" w:hanging="360"/>
+      </w:pPr>
+      <w:rPr>
+        <w:rFonts w:ascii="Courier New" w:hAnsi="Courier New" w:cs="Courier New" w:hint="default"/>
+      </w:rPr>
+    </w:lvl>
+    <w:lvl w:ilvl="2" w:tplc="08090005" w:tentative="1">
+      <w:start w:val="1"/>
+      <w:numFmt w:val="bullet"/>
+      <w:lvlText w:val=""/>
+      <w:lvlJc w:val="left"/>
+      <w:pPr>
+        <w:ind w:left="2520" w:hanging="360"/>
+      </w:pPr>
+      <w:rPr>
+        <w:rFonts w:ascii="Wingdings" w:hAnsi="Wingdings" w:hint="default"/>
+      </w:rPr>
+    </w:lvl>
+    <w:lvl w:ilvl="3" w:tplc="08090001" w:tentative="1">
+      <w:start w:val="1"/>
+      <w:numFmt w:val="bullet"/>
+      <w:lvlText w:val=""/>
+      <w:lvlJc w:val="left"/>
+      <w:pPr>
+        <w:ind w:left="3240" w:hanging="360"/>
+      </w:pPr>
+      <w:rPr>
+        <w:rFonts w:ascii="Symbol" w:hAnsi="Symbol" w:hint="default"/>
+      </w:rPr>
+    </w:lvl>
+    <w:lvl w:ilvl="4" w:tplc="08090003" w:tentative="1">
+      <w:start w:val="1"/>
+      <w:numFmt w:val="bullet"/>
+      <w:lvlText w:val="o"/>
+      <w:lvlJc w:val="left"/>
+      <w:pPr>
+        <w:ind w:left="3960" w:hanging="360"/>
+      </w:pPr>
+      <w:rPr>
+        <w:rFonts w:ascii="Courier New" w:hAnsi="Courier New" w:cs="Courier New" w:hint="default"/>
+      </w:rPr>
+    </w:lvl>
+    <w:lvl w:ilvl="5" w:tplc="08090005" w:tentative="1">
+      <w:start w:val="1"/>
+      <w:numFmt w:val="bullet"/>
+      <w:lvlText w:val=""/>
+      <w:lvlJc w:val="left"/>
+      <w:pPr>
+        <w:ind w:left="4680" w:hanging="360"/>
+      </w:pPr>
+      <w:rPr>
+        <w:rFonts w:ascii="Wingdings" w:hAnsi="Wingdings" w:hint="default"/>
+      </w:rPr>
+    </w:lvl>
+    <w:lvl w:ilvl="6" w:tplc="08090001" w:tentative="1">
+      <w:start w:val="1"/>
+      <w:numFmt w:val="bullet"/>
+      <w:lvlText w:val=""/>
+      <w:lvlJc w:val="left"/>
+      <w:pPr>
+        <w:ind w:left="5400" w:hanging="360"/>
+      </w:pPr>
+      <w:rPr>
+        <w:rFonts w:ascii="Symbol" w:hAnsi="Symbol" w:hint="default"/>
+      </w:rPr>
+    </w:lvl>
+    <w:lvl w:ilvl="7" w:tplc="08090003" w:tentative="1">
+      <w:start w:val="1"/>
+      <w:numFmt w:val="bullet"/>
+      <w:lvlText w:val="o"/>
+      <w:lvlJc w:val="left"/>
+      <w:pPr>
+        <w:ind w:left="6120" w:hanging="360"/>
+      </w:pPr>
+      <w:rPr>
+        <w:rFonts w:ascii="Courier New" w:hAnsi="Courier New" w:cs="Courier New" w:hint="default"/>
+      </w:rPr>
+    </w:lvl>
+    <w:lvl w:ilvl="8" w:tplc="08090005" w:tentative="1">
+      <w:start w:val="1"/>
+      <w:numFmt w:val="bullet"/>
+      <w:lvlText w:val=""/>
+      <w:lvlJc w:val="left"/>
+      <w:pPr>
+        <w:ind w:left="6840" w:hanging="360"/>
+      </w:pPr>
+      <w:rPr>
+        <w:rFonts w:ascii="Wingdings" w:hAnsi="Wingdings" w:hint="default"/>
+      </w:rPr>
+    </w:lvl>
+  </w:abstractNum>
+  <w:abstractNum w:abstractNumId="31" w15:restartNumberingAfterBreak="0">
     <w:nsid w:val="7603301E"/>
     <w:multiLevelType w:val="multilevel"/>
     <w:tmpl w:val="7CF42B92"/>
@@ -4567,7 +6326,7 @@
       </w:rPr>
     </w:lvl>
   </w:abstractNum>
-  <w:abstractNum w:abstractNumId="24" w15:restartNumberingAfterBreak="0">
+  <w:abstractNum w:abstractNumId="32" w15:restartNumberingAfterBreak="0">
     <w:nsid w:val="790D3C94"/>
     <w:multiLevelType w:val="multilevel"/>
     <w:tmpl w:val="851CFE74"/>
@@ -4716,7 +6475,7 @@
       </w:rPr>
     </w:lvl>
   </w:abstractNum>
-  <w:abstractNum w:abstractNumId="25" w15:restartNumberingAfterBreak="0">
+  <w:abstractNum w:abstractNumId="33" w15:restartNumberingAfterBreak="0">
     <w:nsid w:val="795B6404"/>
     <w:multiLevelType w:val="multilevel"/>
     <w:tmpl w:val="1B02616E"/>
@@ -4860,7 +6619,7 @@
       </w:rPr>
     </w:lvl>
   </w:abstractNum>
-  <w:abstractNum w:abstractNumId="26" w15:restartNumberingAfterBreak="0">
+  <w:abstractNum w:abstractNumId="34" w15:restartNumberingAfterBreak="0">
     <w:nsid w:val="7A363851"/>
     <w:multiLevelType w:val="multilevel"/>
     <w:tmpl w:val="8092F6D2"/>
@@ -5009,7 +6768,120 @@
       </w:rPr>
     </w:lvl>
   </w:abstractNum>
-  <w:abstractNum w:abstractNumId="27" w15:restartNumberingAfterBreak="0">
+  <w:abstractNum w:abstractNumId="35" w15:restartNumberingAfterBreak="0">
+    <w:nsid w:val="7BC32F24"/>
+    <w:multiLevelType w:val="hybridMultilevel"/>
+    <w:tmpl w:val="8AB84D02"/>
+    <w:lvl w:ilvl="0" w:tplc="08090001">
+      <w:start w:val="1"/>
+      <w:numFmt w:val="bullet"/>
+      <w:lvlText w:val=""/>
+      <w:lvlJc w:val="left"/>
+      <w:pPr>
+        <w:ind w:left="1080" w:hanging="360"/>
+      </w:pPr>
+      <w:rPr>
+        <w:rFonts w:ascii="Symbol" w:hAnsi="Symbol" w:hint="default"/>
+      </w:rPr>
+    </w:lvl>
+    <w:lvl w:ilvl="1" w:tplc="08090003" w:tentative="1">
+      <w:start w:val="1"/>
+      <w:numFmt w:val="bullet"/>
+      <w:lvlText w:val="o"/>
+      <w:lvlJc w:val="left"/>
+      <w:pPr>
+        <w:ind w:left="1800" w:hanging="360"/>
+      </w:pPr>
+      <w:rPr>
+        <w:rFonts w:ascii="Courier New" w:hAnsi="Courier New" w:cs="Courier New" w:hint="default"/>
+      </w:rPr>
+    </w:lvl>
+    <w:lvl w:ilvl="2" w:tplc="08090005" w:tentative="1">
+      <w:start w:val="1"/>
+      <w:numFmt w:val="bullet"/>
+      <w:lvlText w:val=""/>
+      <w:lvlJc w:val="left"/>
+      <w:pPr>
+        <w:ind w:left="2520" w:hanging="360"/>
+      </w:pPr>
+      <w:rPr>
+        <w:rFonts w:ascii="Wingdings" w:hAnsi="Wingdings" w:hint="default"/>
+      </w:rPr>
+    </w:lvl>
+    <w:lvl w:ilvl="3" w:tplc="08090001" w:tentative="1">
+      <w:start w:val="1"/>
+      <w:numFmt w:val="bullet"/>
+      <w:lvlText w:val=""/>
+      <w:lvlJc w:val="left"/>
+      <w:pPr>
+        <w:ind w:left="3240" w:hanging="360"/>
+      </w:pPr>
+      <w:rPr>
+        <w:rFonts w:ascii="Symbol" w:hAnsi="Symbol" w:hint="default"/>
+      </w:rPr>
+    </w:lvl>
+    <w:lvl w:ilvl="4" w:tplc="08090003" w:tentative="1">
+      <w:start w:val="1"/>
+      <w:numFmt w:val="bullet"/>
+      <w:lvlText w:val="o"/>
+      <w:lvlJc w:val="left"/>
+      <w:pPr>
+        <w:ind w:left="3960" w:hanging="360"/>
+      </w:pPr>
+      <w:rPr>
+        <w:rFonts w:ascii="Courier New" w:hAnsi="Courier New" w:cs="Courier New" w:hint="default"/>
+      </w:rPr>
+    </w:lvl>
+    <w:lvl w:ilvl="5" w:tplc="08090005" w:tentative="1">
+      <w:start w:val="1"/>
+      <w:numFmt w:val="bullet"/>
+      <w:lvlText w:val=""/>
+      <w:lvlJc w:val="left"/>
+      <w:pPr>
+        <w:ind w:left="4680" w:hanging="360"/>
+      </w:pPr>
+      <w:rPr>
+        <w:rFonts w:ascii="Wingdings" w:hAnsi="Wingdings" w:hint="default"/>
+      </w:rPr>
+    </w:lvl>
+    <w:lvl w:ilvl="6" w:tplc="08090001" w:tentative="1">
+      <w:start w:val="1"/>
+      <w:numFmt w:val="bullet"/>
+      <w:lvlText w:val=""/>
+      <w:lvlJc w:val="left"/>
+      <w:pPr>
+        <w:ind w:left="5400" w:hanging="360"/>
+      </w:pPr>
+      <w:rPr>
+        <w:rFonts w:ascii="Symbol" w:hAnsi="Symbol" w:hint="default"/>
+      </w:rPr>
+    </w:lvl>
+    <w:lvl w:ilvl="7" w:tplc="08090003" w:tentative="1">
+      <w:start w:val="1"/>
+      <w:numFmt w:val="bullet"/>
+      <w:lvlText w:val="o"/>
+      <w:lvlJc w:val="left"/>
+      <w:pPr>
+        <w:ind w:left="6120" w:hanging="360"/>
+      </w:pPr>
+      <w:rPr>
+        <w:rFonts w:ascii="Courier New" w:hAnsi="Courier New" w:cs="Courier New" w:hint="default"/>
+      </w:rPr>
+    </w:lvl>
+    <w:lvl w:ilvl="8" w:tplc="08090005" w:tentative="1">
+      <w:start w:val="1"/>
+      <w:numFmt w:val="bullet"/>
+      <w:lvlText w:val=""/>
+      <w:lvlJc w:val="left"/>
+      <w:pPr>
+        <w:ind w:left="6840" w:hanging="360"/>
+      </w:pPr>
+      <w:rPr>
+        <w:rFonts w:ascii="Wingdings" w:hAnsi="Wingdings" w:hint="default"/>
+      </w:rPr>
+    </w:lvl>
+  </w:abstractNum>
+  <w:abstractNum w:abstractNumId="36" w15:restartNumberingAfterBreak="0">
     <w:nsid w:val="7DBC6026"/>
     <w:multiLevelType w:val="hybridMultilevel"/>
     <w:tmpl w:val="99A4C210"/>
@@ -5123,88 +6995,115 @@
     </w:lvl>
   </w:abstractNum>
   <w:num w:numId="1" w16cid:durableId="544831804">
+    <w:abstractNumId w:val="33"/>
+  </w:num>
+  <w:num w:numId="2" w16cid:durableId="297682685">
+    <w:abstractNumId w:val="14"/>
+  </w:num>
+  <w:num w:numId="3" w16cid:durableId="2144731151">
+    <w:abstractNumId w:val="1"/>
+  </w:num>
+  <w:num w:numId="4" w16cid:durableId="2110587856">
+    <w:abstractNumId w:val="31"/>
+  </w:num>
+  <w:num w:numId="5" w16cid:durableId="1824546431">
+    <w:abstractNumId w:val="23"/>
+  </w:num>
+  <w:num w:numId="6" w16cid:durableId="398942693">
     <w:abstractNumId w:val="25"/>
   </w:num>
-  <w:num w:numId="2" w16cid:durableId="297682685">
+  <w:num w:numId="7" w16cid:durableId="9726124">
+    <w:abstractNumId w:val="27"/>
+  </w:num>
+  <w:num w:numId="8" w16cid:durableId="465708458">
+    <w:abstractNumId w:val="19"/>
+  </w:num>
+  <w:num w:numId="9" w16cid:durableId="488987445">
+    <w:abstractNumId w:val="9"/>
+  </w:num>
+  <w:num w:numId="10" w16cid:durableId="140276633">
+    <w:abstractNumId w:val="17"/>
+  </w:num>
+  <w:num w:numId="11" w16cid:durableId="236479953">
+    <w:abstractNumId w:val="2"/>
+  </w:num>
+  <w:num w:numId="12" w16cid:durableId="1891109381">
+    <w:abstractNumId w:val="21"/>
+  </w:num>
+  <w:num w:numId="13" w16cid:durableId="146745646">
+    <w:abstractNumId w:val="7"/>
+  </w:num>
+  <w:num w:numId="14" w16cid:durableId="924994931">
+    <w:abstractNumId w:val="32"/>
+  </w:num>
+  <w:num w:numId="15" w16cid:durableId="1976334187">
+    <w:abstractNumId w:val="29"/>
+  </w:num>
+  <w:num w:numId="16" w16cid:durableId="423189554">
+    <w:abstractNumId w:val="12"/>
+  </w:num>
+  <w:num w:numId="17" w16cid:durableId="206651924">
+    <w:abstractNumId w:val="10"/>
+  </w:num>
+  <w:num w:numId="18" w16cid:durableId="1797720644">
+    <w:abstractNumId w:val="15"/>
+  </w:num>
+  <w:num w:numId="19" w16cid:durableId="1154562593">
+    <w:abstractNumId w:val="34"/>
+  </w:num>
+  <w:num w:numId="20" w16cid:durableId="993485554">
+    <w:abstractNumId w:val="20"/>
+  </w:num>
+  <w:num w:numId="21" w16cid:durableId="2025352870">
+    <w:abstractNumId w:val="4"/>
+  </w:num>
+  <w:num w:numId="22" w16cid:durableId="24523866">
     <w:abstractNumId w:val="11"/>
   </w:num>
-  <w:num w:numId="3" w16cid:durableId="2144731151">
+  <w:num w:numId="23" w16cid:durableId="1939170875">
+    <w:abstractNumId w:val="13"/>
+  </w:num>
+  <w:num w:numId="24" w16cid:durableId="263150381">
+    <w:abstractNumId w:val="6"/>
+  </w:num>
+  <w:num w:numId="25" w16cid:durableId="263879054">
+    <w:abstractNumId w:val="8"/>
+  </w:num>
+  <w:num w:numId="26" w16cid:durableId="1138839963">
+    <w:abstractNumId w:val="36"/>
+  </w:num>
+  <w:num w:numId="27" w16cid:durableId="1899050242">
+    <w:abstractNumId w:val="18"/>
+  </w:num>
+  <w:num w:numId="28" w16cid:durableId="1725832135">
+    <w:abstractNumId w:val="22"/>
+  </w:num>
+  <w:num w:numId="29" w16cid:durableId="1806117530">
+    <w:abstractNumId w:val="24"/>
+  </w:num>
+  <w:num w:numId="30" w16cid:durableId="1060641329">
+    <w:abstractNumId w:val="3"/>
+  </w:num>
+  <w:num w:numId="31" w16cid:durableId="1827234402">
     <w:abstractNumId w:val="0"/>
   </w:num>
-  <w:num w:numId="4" w16cid:durableId="2110587856">
-    <w:abstractNumId w:val="23"/>
+  <w:num w:numId="32" w16cid:durableId="1347488007">
+    <w:abstractNumId w:val="5"/>
   </w:num>
-  <w:num w:numId="5" w16cid:durableId="1824546431">
-    <w:abstractNumId w:val="19"/>
-  </w:num>
-  <w:num w:numId="6" w16cid:durableId="398942693">
-    <w:abstractNumId w:val="20"/>
-  </w:num>
-  <w:num w:numId="7" w16cid:durableId="9726124">
-    <w:abstractNumId w:val="21"/>
-  </w:num>
-  <w:num w:numId="8" w16cid:durableId="465708458">
-    <w:abstractNumId w:val="15"/>
-  </w:num>
-  <w:num w:numId="9" w16cid:durableId="488987445">
-    <w:abstractNumId w:val="6"/>
-  </w:num>
-  <w:num w:numId="10" w16cid:durableId="140276633">
-    <w:abstractNumId w:val="13"/>
-  </w:num>
-  <w:num w:numId="11" w16cid:durableId="236479953">
-    <w:abstractNumId w:val="1"/>
-  </w:num>
-  <w:num w:numId="12" w16cid:durableId="1891109381">
-    <w:abstractNumId w:val="17"/>
-  </w:num>
-  <w:num w:numId="13" w16cid:durableId="146745646">
-    <w:abstractNumId w:val="4"/>
-  </w:num>
-  <w:num w:numId="14" w16cid:durableId="924994931">
-    <w:abstractNumId w:val="24"/>
-  </w:num>
-  <w:num w:numId="15" w16cid:durableId="1976334187">
-    <w:abstractNumId w:val="22"/>
-  </w:num>
-  <w:num w:numId="16" w16cid:durableId="423189554">
-    <w:abstractNumId w:val="9"/>
-  </w:num>
-  <w:num w:numId="17" w16cid:durableId="206651924">
-    <w:abstractNumId w:val="7"/>
-  </w:num>
-  <w:num w:numId="18" w16cid:durableId="1797720644">
-    <w:abstractNumId w:val="12"/>
-  </w:num>
-  <w:num w:numId="19" w16cid:durableId="1154562593">
+  <w:num w:numId="33" w16cid:durableId="788742841">
     <w:abstractNumId w:val="26"/>
   </w:num>
-  <w:num w:numId="20" w16cid:durableId="993485554">
+  <w:num w:numId="34" w16cid:durableId="1567960469">
+    <w:abstractNumId w:val="28"/>
+  </w:num>
+  <w:num w:numId="35" w16cid:durableId="1994291514">
+    <w:abstractNumId w:val="30"/>
+  </w:num>
+  <w:num w:numId="36" w16cid:durableId="630675861">
+    <w:abstractNumId w:val="35"/>
+  </w:num>
+  <w:num w:numId="37" w16cid:durableId="1518930578">
     <w:abstractNumId w:val="16"/>
-  </w:num>
-  <w:num w:numId="21" w16cid:durableId="2025352870">
-    <w:abstractNumId w:val="2"/>
-  </w:num>
-  <w:num w:numId="22" w16cid:durableId="24523866">
-    <w:abstractNumId w:val="8"/>
-  </w:num>
-  <w:num w:numId="23" w16cid:durableId="1939170875">
-    <w:abstractNumId w:val="10"/>
-  </w:num>
-  <w:num w:numId="24" w16cid:durableId="263150381">
-    <w:abstractNumId w:val="3"/>
-  </w:num>
-  <w:num w:numId="25" w16cid:durableId="263879054">
-    <w:abstractNumId w:val="5"/>
-  </w:num>
-  <w:num w:numId="26" w16cid:durableId="1138839963">
-    <w:abstractNumId w:val="27"/>
-  </w:num>
-  <w:num w:numId="27" w16cid:durableId="1899050242">
-    <w:abstractNumId w:val="14"/>
-  </w:num>
-  <w:num w:numId="28" w16cid:durableId="1725832135">
-    <w:abstractNumId w:val="18"/>
   </w:num>
 </w:numbering>
 </file>

</xml_diff>